<commit_message>
DEMO: Update Kaizen Report and Dashboard
</commit_message>
<xml_diff>
--- a/Simulation Agent Prompt.docx
+++ b/Simulation Agent Prompt.docx
@@ -172,254 +172,502 @@
     <w:p>
       <w:pPr>
         <w:spacing w:after="0"/>
-      </w:pPr>
-      <w:r>
+        <w:rPr>
+          <w:sz w:val="20"/>
+          <w:szCs w:val="20"/>
+        </w:rPr>
+      </w:pPr>
+      <w:r>
+        <w:rPr>
+          <w:sz w:val="20"/>
+          <w:szCs w:val="20"/>
+        </w:rPr>
         <w:t>Run the full simulator workflow for this repo template.</w:t>
       </w:r>
     </w:p>
     <w:p>
       <w:pPr>
         <w:spacing w:after="0"/>
-      </w:pPr>
-    </w:p>
-    <w:p>
-      <w:pPr>
-        <w:spacing w:after="0"/>
-      </w:pPr>
-      <w:r>
+        <w:rPr>
+          <w:sz w:val="20"/>
+          <w:szCs w:val="20"/>
+        </w:rPr>
+      </w:pPr>
+    </w:p>
+    <w:p>
+      <w:pPr>
+        <w:spacing w:after="0"/>
+        <w:rPr>
+          <w:sz w:val="20"/>
+          <w:szCs w:val="20"/>
+        </w:rPr>
+      </w:pPr>
+      <w:r>
+        <w:rPr>
+          <w:sz w:val="20"/>
+          <w:szCs w:val="20"/>
+        </w:rPr>
         <w:t>Context:</w:t>
       </w:r>
     </w:p>
     <w:p>
       <w:pPr>
         <w:spacing w:after="0"/>
-      </w:pPr>
-      <w:r>
+        <w:rPr>
+          <w:sz w:val="20"/>
+          <w:szCs w:val="20"/>
+        </w:rPr>
+      </w:pPr>
+      <w:r>
+        <w:rPr>
+          <w:sz w:val="20"/>
+          <w:szCs w:val="20"/>
+        </w:rPr>
         <w:t>This repo is a TEMPLATE for a bottleneck forecasting simulator (non-DES).</w:t>
       </w:r>
     </w:p>
     <w:p>
       <w:pPr>
         <w:spacing w:after="0"/>
-      </w:pPr>
-      <w:r>
+        <w:rPr>
+          <w:sz w:val="20"/>
+          <w:szCs w:val="20"/>
+        </w:rPr>
+      </w:pPr>
+      <w:r>
+        <w:rPr>
+          <w:sz w:val="20"/>
+          <w:szCs w:val="20"/>
+        </w:rPr>
         <w:t>Goal: forecast bottlenecks from parameter changes, not discrete-event token simulation.</w:t>
       </w:r>
     </w:p>
     <w:p>
       <w:pPr>
         <w:spacing w:after="0"/>
-      </w:pPr>
-    </w:p>
-    <w:p>
-      <w:pPr>
-        <w:spacing w:after="0"/>
-      </w:pPr>
-      <w:r>
+        <w:rPr>
+          <w:sz w:val="20"/>
+          <w:szCs w:val="20"/>
+        </w:rPr>
+      </w:pPr>
+    </w:p>
+    <w:p>
+      <w:pPr>
+        <w:spacing w:after="0"/>
+        <w:rPr>
+          <w:sz w:val="20"/>
+          <w:szCs w:val="20"/>
+        </w:rPr>
+      </w:pPr>
+      <w:r>
+        <w:rPr>
+          <w:sz w:val="20"/>
+          <w:szCs w:val="20"/>
+        </w:rPr>
         <w:t>Inputs:</w:t>
       </w:r>
     </w:p>
     <w:p>
       <w:pPr>
         <w:spacing w:after="0"/>
-      </w:pPr>
-      <w:r>
+        <w:rPr>
+          <w:sz w:val="20"/>
+          <w:szCs w:val="20"/>
+        </w:rPr>
+      </w:pPr>
+      <w:r>
+        <w:rPr>
+          <w:sz w:val="20"/>
+          <w:szCs w:val="20"/>
+        </w:rPr>
         <w:t>I am attaching the VSM image(s) as source of truth.</w:t>
       </w:r>
     </w:p>
     <w:p>
       <w:pPr>
         <w:spacing w:after="0"/>
-      </w:pPr>
-      <w:r>
+        <w:rPr>
+          <w:sz w:val="20"/>
+          <w:szCs w:val="20"/>
+        </w:rPr>
+      </w:pPr>
+      <w:r>
+        <w:rPr>
+          <w:sz w:val="20"/>
+          <w:szCs w:val="20"/>
+        </w:rPr>
         <w:t>Use visible values only from the image(s).</w:t>
       </w:r>
     </w:p>
     <w:p>
       <w:pPr>
         <w:spacing w:after="0"/>
-      </w:pPr>
-    </w:p>
-    <w:p>
-      <w:pPr>
-        <w:spacing w:after="0"/>
-      </w:pPr>
-      <w:r>
+        <w:rPr>
+          <w:sz w:val="20"/>
+          <w:szCs w:val="20"/>
+        </w:rPr>
+      </w:pPr>
+    </w:p>
+    <w:p>
+      <w:pPr>
+        <w:spacing w:after="0"/>
+        <w:rPr>
+          <w:sz w:val="20"/>
+          <w:szCs w:val="20"/>
+        </w:rPr>
+      </w:pPr>
+      <w:r>
+        <w:rPr>
+          <w:sz w:val="20"/>
+          <w:szCs w:val="20"/>
+        </w:rPr>
         <w:t>Execution mode:</w:t>
       </w:r>
     </w:p>
     <w:p>
       <w:pPr>
         <w:spacing w:after="0"/>
-      </w:pPr>
-      <w:r>
+        <w:rPr>
+          <w:sz w:val="20"/>
+          <w:szCs w:val="20"/>
+        </w:rPr>
+      </w:pPr>
+      <w:r>
+        <w:rPr>
+          <w:sz w:val="20"/>
+          <w:szCs w:val="20"/>
+        </w:rPr>
         <w:t>Run in phases.</w:t>
       </w:r>
     </w:p>
     <w:p>
       <w:pPr>
         <w:spacing w:after="0"/>
-      </w:pPr>
-      <w:r>
+        <w:rPr>
+          <w:sz w:val="20"/>
+          <w:szCs w:val="20"/>
+        </w:rPr>
+      </w:pPr>
+      <w:r>
+        <w:rPr>
+          <w:sz w:val="20"/>
+          <w:szCs w:val="20"/>
+        </w:rPr>
         <w:t>After each phase, print:</w:t>
       </w:r>
     </w:p>
     <w:p>
       <w:pPr>
         <w:spacing w:after="0"/>
-      </w:pPr>
-      <w:r>
+        <w:rPr>
+          <w:sz w:val="20"/>
+          <w:szCs w:val="20"/>
+        </w:rPr>
+      </w:pPr>
+      <w:r>
+        <w:rPr>
+          <w:sz w:val="20"/>
+          <w:szCs w:val="20"/>
+        </w:rPr>
         <w:t>1. a short summary</w:t>
       </w:r>
     </w:p>
     <w:p>
       <w:pPr>
         <w:spacing w:after="0"/>
-      </w:pPr>
-      <w:r>
+        <w:rPr>
+          <w:sz w:val="20"/>
+          <w:szCs w:val="20"/>
+        </w:rPr>
+      </w:pPr>
+      <w:r>
+        <w:rPr>
+          <w:sz w:val="20"/>
+          <w:szCs w:val="20"/>
+        </w:rPr>
         <w:t>2. files changed</w:t>
       </w:r>
     </w:p>
     <w:p>
       <w:pPr>
         <w:spacing w:after="0"/>
-      </w:pPr>
-      <w:r>
+        <w:rPr>
+          <w:sz w:val="20"/>
+          <w:szCs w:val="20"/>
+        </w:rPr>
+      </w:pPr>
+      <w:r>
+        <w:rPr>
+          <w:sz w:val="20"/>
+          <w:szCs w:val="20"/>
+        </w:rPr>
         <w:t>Then continue automatically to the next phase unless you hit a real blocker.</w:t>
       </w:r>
     </w:p>
     <w:p>
       <w:pPr>
         <w:spacing w:after="0"/>
-      </w:pPr>
-      <w:r>
+        <w:rPr>
+          <w:sz w:val="20"/>
+          <w:szCs w:val="20"/>
+        </w:rPr>
+      </w:pPr>
+      <w:r>
+        <w:rPr>
+          <w:sz w:val="20"/>
+          <w:szCs w:val="20"/>
+        </w:rPr>
         <w:t>Only stop and ask “continue?” if required input is missing, a value is unreadable/ambiguous in a way that changes the model materially, a dependency must be added, or an action is risky/destructive.</w:t>
       </w:r>
     </w:p>
     <w:p>
       <w:pPr>
         <w:spacing w:after="0"/>
-      </w:pPr>
-    </w:p>
-    <w:p>
-      <w:pPr>
-        <w:spacing w:after="0"/>
-      </w:pPr>
-      <w:r>
+        <w:rPr>
+          <w:sz w:val="20"/>
+          <w:szCs w:val="20"/>
+        </w:rPr>
+      </w:pPr>
+    </w:p>
+    <w:p>
+      <w:pPr>
+        <w:spacing w:after="0"/>
+        <w:rPr>
+          <w:sz w:val="20"/>
+          <w:szCs w:val="20"/>
+        </w:rPr>
+      </w:pPr>
+      <w:r>
+        <w:rPr>
+          <w:sz w:val="20"/>
+          <w:szCs w:val="20"/>
+        </w:rPr>
         <w:t>Constraints:</w:t>
       </w:r>
     </w:p>
     <w:p>
       <w:pPr>
         <w:spacing w:after="0"/>
-      </w:pPr>
-      <w:r>
+        <w:rPr>
+          <w:sz w:val="20"/>
+          <w:szCs w:val="20"/>
+        </w:rPr>
+      </w:pPr>
+      <w:r>
+        <w:rPr>
+          <w:sz w:val="20"/>
+          <w:szCs w:val="20"/>
+        </w:rPr>
         <w:t>- Do NOT rename, merge, or reorder VSM process steps.</w:t>
       </w:r>
     </w:p>
     <w:p>
       <w:pPr>
         <w:spacing w:after="0"/>
-      </w:pPr>
-      <w:r>
+        <w:rPr>
+          <w:sz w:val="20"/>
+          <w:szCs w:val="20"/>
+        </w:rPr>
+      </w:pPr>
+      <w:r>
+        <w:rPr>
+          <w:sz w:val="20"/>
+          <w:szCs w:val="20"/>
+        </w:rPr>
         <w:t>- Preserve step names EXACTLY as shown in the image.</w:t>
       </w:r>
     </w:p>
     <w:p>
       <w:pPr>
         <w:spacing w:after="0"/>
-      </w:pPr>
-      <w:r>
+        <w:rPr>
+          <w:sz w:val="20"/>
+          <w:szCs w:val="20"/>
+        </w:rPr>
+      </w:pPr>
+      <w:r>
+        <w:rPr>
+          <w:sz w:val="20"/>
+          <w:szCs w:val="20"/>
+        </w:rPr>
         <w:t>- Preserve left-to-right sequence EXACTLY.</w:t>
       </w:r>
     </w:p>
     <w:p>
       <w:pPr>
         <w:spacing w:after="0"/>
-      </w:pPr>
-      <w:r>
+        <w:rPr>
+          <w:sz w:val="20"/>
+          <w:szCs w:val="20"/>
+        </w:rPr>
+      </w:pPr>
+      <w:r>
+        <w:rPr>
+          <w:sz w:val="20"/>
+          <w:szCs w:val="20"/>
+        </w:rPr>
+        <w:t>- Extract only visible values: CT, C/O, waits, workers, parallel procedures, notes.</w:t>
+      </w:r>
+    </w:p>
+    <w:p>
+      <w:pPr>
+        <w:spacing w:after="0"/>
+        <w:rPr>
+          <w:sz w:val="20"/>
+          <w:szCs w:val="20"/>
+        </w:rPr>
+      </w:pPr>
+      <w:r>
+        <w:rPr>
+          <w:sz w:val="20"/>
+          <w:szCs w:val="20"/>
+        </w:rPr>
+        <w:t>- If ambiguous or unreadable, set value = null and document it.</w:t>
+      </w:r>
+    </w:p>
+    <w:p>
+      <w:pPr>
+        <w:spacing w:after="0"/>
+        <w:rPr>
+          <w:sz w:val="20"/>
+          <w:szCs w:val="20"/>
+        </w:rPr>
+      </w:pPr>
+      <w:r>
+        <w:rPr>
+          <w:sz w:val="20"/>
+          <w:szCs w:val="20"/>
+        </w:rPr>
+        <w:t>- Do NOT add new dependencies without asking once.</w:t>
+      </w:r>
+    </w:p>
+    <w:p>
+      <w:pPr>
+        <w:spacing w:after="0"/>
+        <w:rPr>
+          <w:sz w:val="20"/>
+          <w:szCs w:val="20"/>
+        </w:rPr>
+      </w:pPr>
+      <w:r>
+        <w:rPr>
+          <w:sz w:val="20"/>
+          <w:szCs w:val="20"/>
+        </w:rPr>
+        <w:t>- Do NOT change layout structure: left params, top KPIs, center canvas.</w:t>
+      </w:r>
+    </w:p>
+    <w:p>
+      <w:pPr>
+        <w:spacing w:after="0"/>
+        <w:rPr>
+          <w:sz w:val="20"/>
+          <w:szCs w:val="20"/>
+        </w:rPr>
+      </w:pPr>
+      <w:r>
+        <w:rPr>
+          <w:sz w:val="20"/>
+          <w:szCs w:val="20"/>
+        </w:rPr>
+        <w:t>- Keep this as a non-DES forecast model unless I explicitly ask for DES.</w:t>
+      </w:r>
+    </w:p>
+    <w:p>
+      <w:pPr>
+        <w:spacing w:after="0"/>
+        <w:rPr>
+          <w:sz w:val="20"/>
+          <w:szCs w:val="20"/>
+        </w:rPr>
+      </w:pPr>
+    </w:p>
+    <w:p>
+      <w:pPr>
+        <w:spacing w:after="0"/>
+        <w:rPr>
+          <w:sz w:val="20"/>
+          <w:szCs w:val="20"/>
+        </w:rPr>
+      </w:pPr>
+      <w:r>
+        <w:rPr>
+          <w:sz w:val="20"/>
+          <w:szCs w:val="20"/>
+        </w:rPr>
         <w:lastRenderedPageBreak/>
-        <w:t>- Extract only visible values: CT, C/O, waits, workers, parallel procedures, notes.</w:t>
-      </w:r>
-    </w:p>
-    <w:p>
-      <w:pPr>
-        <w:spacing w:after="0"/>
-      </w:pPr>
-      <w:r>
-        <w:t>- If ambiguous or unreadable, set value = null and document it.</w:t>
-      </w:r>
-    </w:p>
-    <w:p>
-      <w:pPr>
-        <w:spacing w:after="0"/>
-      </w:pPr>
-      <w:r>
-        <w:t>- Do NOT add new dependencies without asking once.</w:t>
-      </w:r>
-    </w:p>
-    <w:p>
-      <w:pPr>
-        <w:spacing w:after="0"/>
-      </w:pPr>
-      <w:r>
-        <w:t>- Do NOT change layout structure: left params, top KPIs, center canvas.</w:t>
-      </w:r>
-    </w:p>
-    <w:p>
-      <w:pPr>
-        <w:spacing w:after="0"/>
-      </w:pPr>
-      <w:r>
-        <w:t>- Keep this as a non-DES forecast model unless I explicitly ask for DES.</w:t>
-      </w:r>
-    </w:p>
-    <w:p>
-      <w:pPr>
-        <w:spacing w:after="0"/>
-      </w:pPr>
-    </w:p>
-    <w:p>
-      <w:pPr>
-        <w:spacing w:after="0"/>
-      </w:pPr>
-      <w:r>
         <w:t>PHASE 1 — Strict VSM transcription</w:t>
       </w:r>
     </w:p>
     <w:p>
       <w:pPr>
         <w:spacing w:after="0"/>
-      </w:pPr>
-      <w:r>
+        <w:rPr>
+          <w:sz w:val="20"/>
+          <w:szCs w:val="20"/>
+        </w:rPr>
+      </w:pPr>
+      <w:r>
+        <w:rPr>
+          <w:sz w:val="20"/>
+          <w:szCs w:val="20"/>
+        </w:rPr>
         <w:t xml:space="preserve">Use skill: </w:t>
       </w:r>
       <w:proofErr w:type="spellStart"/>
       <w:r>
+        <w:rPr>
+          <w:sz w:val="20"/>
+          <w:szCs w:val="20"/>
+        </w:rPr>
         <w:t>vsm</w:t>
       </w:r>
       <w:proofErr w:type="spellEnd"/>
       <w:r>
+        <w:rPr>
+          <w:sz w:val="20"/>
+          <w:szCs w:val="20"/>
+        </w:rPr>
         <w:t>-to-sim-model</w:t>
       </w:r>
     </w:p>
     <w:p>
       <w:pPr>
         <w:spacing w:after="0"/>
-      </w:pPr>
-      <w:r>
+        <w:rPr>
+          <w:sz w:val="20"/>
+          <w:szCs w:val="20"/>
+        </w:rPr>
+      </w:pPr>
+      <w:r>
+        <w:rPr>
+          <w:sz w:val="20"/>
+          <w:szCs w:val="20"/>
+        </w:rPr>
         <w:t>Output:</w:t>
       </w:r>
     </w:p>
     <w:p>
       <w:pPr>
         <w:spacing w:after="0"/>
-      </w:pPr>
-      <w:r>
+        <w:rPr>
+          <w:sz w:val="20"/>
+          <w:szCs w:val="20"/>
+        </w:rPr>
+      </w:pPr>
+      <w:r>
+        <w:rPr>
+          <w:sz w:val="20"/>
+          <w:szCs w:val="20"/>
+        </w:rPr>
         <w:t>- models/active/</w:t>
       </w:r>
       <w:proofErr w:type="spellStart"/>
       <w:r>
+        <w:rPr>
+          <w:sz w:val="20"/>
+          <w:szCs w:val="20"/>
+        </w:rPr>
         <w:t>vsm_graph.json</w:t>
       </w:r>
       <w:proofErr w:type="spellEnd"/>
@@ -427,12 +675,24 @@
     <w:p>
       <w:pPr>
         <w:spacing w:after="0"/>
-      </w:pPr>
-      <w:r>
+        <w:rPr>
+          <w:sz w:val="20"/>
+          <w:szCs w:val="20"/>
+        </w:rPr>
+      </w:pPr>
+      <w:r>
+        <w:rPr>
+          <w:sz w:val="20"/>
+          <w:szCs w:val="20"/>
+        </w:rPr>
         <w:t>- models/active/</w:t>
       </w:r>
       <w:proofErr w:type="spellStart"/>
       <w:r>
+        <w:rPr>
+          <w:sz w:val="20"/>
+          <w:szCs w:val="20"/>
+        </w:rPr>
         <w:t>master_data.json</w:t>
       </w:r>
       <w:proofErr w:type="spellEnd"/>
@@ -440,57 +700,113 @@
     <w:p>
       <w:pPr>
         <w:spacing w:after="0"/>
-      </w:pPr>
-      <w:r>
+        <w:rPr>
+          <w:sz w:val="20"/>
+          <w:szCs w:val="20"/>
+        </w:rPr>
+      </w:pPr>
+      <w:r>
+        <w:rPr>
+          <w:sz w:val="20"/>
+          <w:szCs w:val="20"/>
+        </w:rPr>
         <w:t>- models/missing_data_report.md</w:t>
       </w:r>
     </w:p>
     <w:p>
       <w:pPr>
         <w:spacing w:after="0"/>
-      </w:pPr>
-    </w:p>
-    <w:p>
-      <w:pPr>
-        <w:spacing w:after="0"/>
-      </w:pPr>
-      <w:r>
+        <w:rPr>
+          <w:sz w:val="20"/>
+          <w:szCs w:val="20"/>
+        </w:rPr>
+      </w:pPr>
+    </w:p>
+    <w:p>
+      <w:pPr>
+        <w:spacing w:after="0"/>
+        <w:rPr>
+          <w:sz w:val="20"/>
+          <w:szCs w:val="20"/>
+        </w:rPr>
+      </w:pPr>
+      <w:r>
+        <w:rPr>
+          <w:sz w:val="20"/>
+          <w:szCs w:val="20"/>
+        </w:rPr>
         <w:t>PHASE 2 — Forecast compilation (non-DES)</w:t>
       </w:r>
     </w:p>
     <w:p>
       <w:pPr>
         <w:spacing w:after="0"/>
-      </w:pPr>
-      <w:r>
+        <w:rPr>
+          <w:sz w:val="20"/>
+          <w:szCs w:val="20"/>
+        </w:rPr>
+      </w:pPr>
+      <w:r>
+        <w:rPr>
+          <w:sz w:val="20"/>
+          <w:szCs w:val="20"/>
+        </w:rPr>
         <w:t xml:space="preserve">Use skill: </w:t>
       </w:r>
       <w:proofErr w:type="spellStart"/>
       <w:r>
+        <w:rPr>
+          <w:sz w:val="20"/>
+          <w:szCs w:val="20"/>
+        </w:rPr>
         <w:t>vsm</w:t>
       </w:r>
       <w:proofErr w:type="spellEnd"/>
       <w:r>
+        <w:rPr>
+          <w:sz w:val="20"/>
+          <w:szCs w:val="20"/>
+        </w:rPr>
         <w:t>-to-sim-model</w:t>
       </w:r>
     </w:p>
     <w:p>
       <w:pPr>
         <w:spacing w:after="0"/>
-      </w:pPr>
-      <w:r>
+        <w:rPr>
+          <w:sz w:val="20"/>
+          <w:szCs w:val="20"/>
+        </w:rPr>
+      </w:pPr>
+      <w:r>
+        <w:rPr>
+          <w:sz w:val="20"/>
+          <w:szCs w:val="20"/>
+        </w:rPr>
         <w:t>Output:</w:t>
       </w:r>
     </w:p>
     <w:p>
       <w:pPr>
         <w:spacing w:after="0"/>
-      </w:pPr>
-      <w:r>
+        <w:rPr>
+          <w:sz w:val="20"/>
+          <w:szCs w:val="20"/>
+        </w:rPr>
+      </w:pPr>
+      <w:r>
+        <w:rPr>
+          <w:sz w:val="20"/>
+          <w:szCs w:val="20"/>
+        </w:rPr>
         <w:t>- models/active/</w:t>
       </w:r>
       <w:proofErr w:type="spellStart"/>
       <w:r>
+        <w:rPr>
+          <w:sz w:val="20"/>
+          <w:szCs w:val="20"/>
+        </w:rPr>
         <w:t>compiled_forecast_model.json</w:t>
       </w:r>
       <w:proofErr w:type="spellEnd"/>
@@ -498,188 +814,371 @@
     <w:p>
       <w:pPr>
         <w:spacing w:after="0"/>
-      </w:pPr>
-    </w:p>
-    <w:p>
-      <w:pPr>
-        <w:spacing w:after="0"/>
-      </w:pPr>
-      <w:r>
+        <w:rPr>
+          <w:sz w:val="20"/>
+          <w:szCs w:val="20"/>
+        </w:rPr>
+      </w:pPr>
+    </w:p>
+    <w:p>
+      <w:pPr>
+        <w:spacing w:after="0"/>
+        <w:rPr>
+          <w:sz w:val="20"/>
+          <w:szCs w:val="20"/>
+        </w:rPr>
+      </w:pPr>
+      <w:r>
+        <w:rPr>
+          <w:sz w:val="20"/>
+          <w:szCs w:val="20"/>
+        </w:rPr>
         <w:t>Model outputs must include:</w:t>
       </w:r>
     </w:p>
     <w:p>
       <w:pPr>
         <w:spacing w:after="0"/>
-      </w:pPr>
-      <w:r>
+        <w:rPr>
+          <w:sz w:val="20"/>
+          <w:szCs w:val="20"/>
+        </w:rPr>
+      </w:pPr>
+      <w:r>
+        <w:rPr>
+          <w:sz w:val="20"/>
+          <w:szCs w:val="20"/>
+        </w:rPr>
         <w:t>- per-step capacity</w:t>
       </w:r>
     </w:p>
     <w:p>
       <w:pPr>
         <w:spacing w:after="0"/>
-      </w:pPr>
-      <w:r>
+        <w:rPr>
+          <w:sz w:val="20"/>
+          <w:szCs w:val="20"/>
+        </w:rPr>
+      </w:pPr>
+      <w:r>
+        <w:rPr>
+          <w:sz w:val="20"/>
+          <w:szCs w:val="20"/>
+        </w:rPr>
         <w:t>- utilization</w:t>
       </w:r>
     </w:p>
     <w:p>
       <w:pPr>
         <w:spacing w:after="0"/>
-      </w:pPr>
-      <w:r>
+        <w:rPr>
+          <w:sz w:val="20"/>
+          <w:szCs w:val="20"/>
+        </w:rPr>
+      </w:pPr>
+      <w:r>
+        <w:rPr>
+          <w:sz w:val="20"/>
+          <w:szCs w:val="20"/>
+        </w:rPr>
         <w:t>- headroom</w:t>
       </w:r>
     </w:p>
     <w:p>
       <w:pPr>
         <w:spacing w:after="0"/>
-      </w:pPr>
-      <w:r>
+        <w:rPr>
+          <w:sz w:val="20"/>
+          <w:szCs w:val="20"/>
+        </w:rPr>
+      </w:pPr>
+      <w:r>
+        <w:rPr>
+          <w:sz w:val="20"/>
+          <w:szCs w:val="20"/>
+        </w:rPr>
         <w:t>- queue risk</w:t>
       </w:r>
     </w:p>
     <w:p>
       <w:pPr>
         <w:spacing w:after="0"/>
-      </w:pPr>
-      <w:r>
+        <w:rPr>
+          <w:sz w:val="20"/>
+          <w:szCs w:val="20"/>
+        </w:rPr>
+      </w:pPr>
+      <w:r>
+        <w:rPr>
+          <w:sz w:val="20"/>
+          <w:szCs w:val="20"/>
+        </w:rPr>
         <w:t>- bottleneck index</w:t>
       </w:r>
     </w:p>
     <w:p>
       <w:pPr>
         <w:spacing w:after="0"/>
-      </w:pPr>
-      <w:r>
+        <w:rPr>
+          <w:sz w:val="20"/>
+          <w:szCs w:val="20"/>
+        </w:rPr>
+      </w:pPr>
+      <w:r>
+        <w:rPr>
+          <w:sz w:val="20"/>
+          <w:szCs w:val="20"/>
+        </w:rPr>
         <w:t>- global throughput</w:t>
       </w:r>
     </w:p>
     <w:p>
       <w:pPr>
         <w:spacing w:after="0"/>
-      </w:pPr>
-      <w:r>
+        <w:rPr>
+          <w:sz w:val="20"/>
+          <w:szCs w:val="20"/>
+        </w:rPr>
+      </w:pPr>
+      <w:r>
+        <w:rPr>
+          <w:sz w:val="20"/>
+          <w:szCs w:val="20"/>
+        </w:rPr>
         <w:t>- brittleness</w:t>
       </w:r>
     </w:p>
     <w:p>
       <w:pPr>
         <w:spacing w:after="0"/>
-      </w:pPr>
-      <w:r>
+        <w:rPr>
+          <w:sz w:val="20"/>
+          <w:szCs w:val="20"/>
+        </w:rPr>
+      </w:pPr>
+      <w:r>
+        <w:rPr>
+          <w:sz w:val="20"/>
+          <w:szCs w:val="20"/>
+        </w:rPr>
         <w:t>- bottleneck migration</w:t>
       </w:r>
     </w:p>
     <w:p>
       <w:pPr>
         <w:spacing w:after="0"/>
-      </w:pPr>
-    </w:p>
-    <w:p>
-      <w:pPr>
-        <w:spacing w:after="0"/>
-      </w:pPr>
-      <w:r>
+        <w:rPr>
+          <w:sz w:val="20"/>
+          <w:szCs w:val="20"/>
+        </w:rPr>
+      </w:pPr>
+    </w:p>
+    <w:p>
+      <w:pPr>
+        <w:spacing w:after="0"/>
+        <w:rPr>
+          <w:sz w:val="20"/>
+          <w:szCs w:val="20"/>
+        </w:rPr>
+      </w:pPr>
+      <w:r>
+        <w:rPr>
+          <w:sz w:val="20"/>
+          <w:szCs w:val="20"/>
+        </w:rPr>
         <w:t>PHASE 3 — UI wiring only</w:t>
       </w:r>
     </w:p>
     <w:p>
       <w:pPr>
         <w:spacing w:after="0"/>
-      </w:pPr>
-      <w:r>
+        <w:rPr>
+          <w:sz w:val="20"/>
+          <w:szCs w:val="20"/>
+        </w:rPr>
+      </w:pPr>
+      <w:r>
+        <w:rPr>
+          <w:sz w:val="20"/>
+          <w:szCs w:val="20"/>
+        </w:rPr>
         <w:t>Bind:</w:t>
       </w:r>
     </w:p>
     <w:p>
       <w:pPr>
         <w:spacing w:after="0"/>
-      </w:pPr>
-      <w:r>
+        <w:rPr>
+          <w:sz w:val="20"/>
+          <w:szCs w:val="20"/>
+        </w:rPr>
+      </w:pPr>
+      <w:r>
+        <w:rPr>
+          <w:sz w:val="20"/>
+          <w:szCs w:val="20"/>
+        </w:rPr>
         <w:t>- left panel to inputs</w:t>
       </w:r>
     </w:p>
     <w:p>
       <w:pPr>
         <w:spacing w:after="0"/>
-      </w:pPr>
-      <w:r>
+        <w:rPr>
+          <w:sz w:val="20"/>
+          <w:szCs w:val="20"/>
+        </w:rPr>
+      </w:pPr>
+      <w:r>
+        <w:rPr>
+          <w:sz w:val="20"/>
+          <w:szCs w:val="20"/>
+        </w:rPr>
         <w:t>- KPI row to forecast outputs</w:t>
       </w:r>
     </w:p>
     <w:p>
       <w:pPr>
         <w:spacing w:after="0"/>
-      </w:pPr>
-      <w:r>
+        <w:rPr>
+          <w:sz w:val="20"/>
+          <w:szCs w:val="20"/>
+        </w:rPr>
+      </w:pPr>
+      <w:r>
+        <w:rPr>
+          <w:sz w:val="20"/>
+          <w:szCs w:val="20"/>
+        </w:rPr>
         <w:t>- node styling to forecast outputs</w:t>
       </w:r>
     </w:p>
     <w:p>
       <w:pPr>
         <w:spacing w:after="0"/>
-      </w:pPr>
-      <w:r>
+        <w:rPr>
+          <w:sz w:val="20"/>
+          <w:szCs w:val="20"/>
+        </w:rPr>
+      </w:pPr>
+      <w:r>
+        <w:rPr>
+          <w:sz w:val="20"/>
+          <w:szCs w:val="20"/>
+        </w:rPr>
         <w:t>Keep:</w:t>
       </w:r>
     </w:p>
     <w:p>
       <w:pPr>
         <w:spacing w:after="0"/>
-      </w:pPr>
-      <w:r>
+        <w:rPr>
+          <w:sz w:val="20"/>
+          <w:szCs w:val="20"/>
+        </w:rPr>
+      </w:pPr>
+      <w:r>
+        <w:rPr>
+          <w:sz w:val="20"/>
+          <w:szCs w:val="20"/>
+        </w:rPr>
         <w:t>- current dark ops theme</w:t>
       </w:r>
     </w:p>
     <w:p>
       <w:pPr>
         <w:spacing w:after="0"/>
-      </w:pPr>
-      <w:r>
+        <w:rPr>
+          <w:sz w:val="20"/>
+          <w:szCs w:val="20"/>
+        </w:rPr>
+      </w:pPr>
+      <w:r>
+        <w:rPr>
+          <w:sz w:val="20"/>
+          <w:szCs w:val="20"/>
+        </w:rPr>
         <w:t>- zoom/pan</w:t>
       </w:r>
     </w:p>
     <w:p>
       <w:pPr>
         <w:spacing w:after="0"/>
-      </w:pPr>
-      <w:r>
+        <w:rPr>
+          <w:sz w:val="20"/>
+          <w:szCs w:val="20"/>
+        </w:rPr>
+      </w:pPr>
+      <w:r>
+        <w:rPr>
+          <w:sz w:val="20"/>
+          <w:szCs w:val="20"/>
+        </w:rPr>
         <w:t>- animated dashed edges</w:t>
       </w:r>
     </w:p>
     <w:p>
       <w:pPr>
         <w:spacing w:after="0"/>
-      </w:pPr>
-    </w:p>
-    <w:p>
-      <w:pPr>
-        <w:spacing w:after="0"/>
-      </w:pPr>
-      <w:r>
-        <w:lastRenderedPageBreak/>
+        <w:rPr>
+          <w:sz w:val="20"/>
+          <w:szCs w:val="20"/>
+        </w:rPr>
+      </w:pPr>
+    </w:p>
+    <w:p>
+      <w:pPr>
+        <w:spacing w:after="0"/>
+        <w:rPr>
+          <w:sz w:val="20"/>
+          <w:szCs w:val="20"/>
+        </w:rPr>
+      </w:pPr>
+      <w:r>
+        <w:rPr>
+          <w:sz w:val="20"/>
+          <w:szCs w:val="20"/>
+        </w:rPr>
         <w:t>Node cards must show:</w:t>
       </w:r>
     </w:p>
     <w:p>
       <w:pPr>
         <w:spacing w:after="0"/>
-      </w:pPr>
-      <w:r>
+        <w:rPr>
+          <w:sz w:val="20"/>
+          <w:szCs w:val="20"/>
+        </w:rPr>
+      </w:pPr>
+      <w:r>
+        <w:rPr>
+          <w:sz w:val="20"/>
+          <w:szCs w:val="20"/>
+        </w:rPr>
         <w:t>- util</w:t>
       </w:r>
     </w:p>
     <w:p>
       <w:pPr>
         <w:spacing w:after="0"/>
-      </w:pPr>
-      <w:r>
+        <w:rPr>
+          <w:sz w:val="20"/>
+          <w:szCs w:val="20"/>
+        </w:rPr>
+      </w:pPr>
+      <w:r>
+        <w:rPr>
+          <w:sz w:val="20"/>
+          <w:szCs w:val="20"/>
+        </w:rPr>
         <w:t>- lot/</w:t>
       </w:r>
       <w:proofErr w:type="spellStart"/>
       <w:r>
+        <w:rPr>
+          <w:sz w:val="20"/>
+          <w:szCs w:val="20"/>
+        </w:rPr>
         <w:t>wip</w:t>
       </w:r>
       <w:proofErr w:type="spellEnd"/>
@@ -687,126 +1186,250 @@
     <w:p>
       <w:pPr>
         <w:spacing w:after="0"/>
-      </w:pPr>
-      <w:r>
+        <w:rPr>
+          <w:sz w:val="20"/>
+          <w:szCs w:val="20"/>
+        </w:rPr>
+      </w:pPr>
+      <w:r>
+        <w:rPr>
+          <w:sz w:val="20"/>
+          <w:szCs w:val="20"/>
+        </w:rPr>
         <w:t>- Completed Lot</w:t>
       </w:r>
     </w:p>
     <w:p>
       <w:pPr>
         <w:spacing w:after="0"/>
-      </w:pPr>
-      <w:r>
+        <w:rPr>
+          <w:sz w:val="20"/>
+          <w:szCs w:val="20"/>
+        </w:rPr>
+      </w:pPr>
+      <w:r>
+        <w:rPr>
+          <w:sz w:val="20"/>
+          <w:szCs w:val="20"/>
+        </w:rPr>
         <w:t>- status</w:t>
       </w:r>
     </w:p>
     <w:p>
       <w:pPr>
         <w:spacing w:after="0"/>
-      </w:pPr>
-    </w:p>
-    <w:p>
-      <w:pPr>
-        <w:spacing w:after="0"/>
-      </w:pPr>
-      <w:r>
+        <w:rPr>
+          <w:sz w:val="20"/>
+          <w:szCs w:val="20"/>
+        </w:rPr>
+      </w:pPr>
+    </w:p>
+    <w:p>
+      <w:pPr>
+        <w:spacing w:after="0"/>
+        <w:rPr>
+          <w:sz w:val="20"/>
+          <w:szCs w:val="20"/>
+        </w:rPr>
+      </w:pPr>
+      <w:r>
+        <w:rPr>
+          <w:sz w:val="20"/>
+          <w:szCs w:val="20"/>
+        </w:rPr>
         <w:t>PHASE 4 — Real-time forecast runtime</w:t>
       </w:r>
     </w:p>
     <w:p>
       <w:pPr>
         <w:spacing w:after="0"/>
-      </w:pPr>
-      <w:r>
+        <w:rPr>
+          <w:sz w:val="20"/>
+          <w:szCs w:val="20"/>
+        </w:rPr>
+      </w:pPr>
+      <w:r>
+        <w:rPr>
+          <w:sz w:val="20"/>
+          <w:szCs w:val="20"/>
+        </w:rPr>
         <w:t>Rules:</w:t>
       </w:r>
     </w:p>
     <w:p>
       <w:pPr>
         <w:spacing w:after="0"/>
-      </w:pPr>
-      <w:r>
+        <w:rPr>
+          <w:sz w:val="20"/>
+          <w:szCs w:val="20"/>
+        </w:rPr>
+      </w:pPr>
+      <w:r>
+        <w:rPr>
+          <w:sz w:val="20"/>
+          <w:szCs w:val="20"/>
+        </w:rPr>
         <w:t>- deterministic live behavior with elapsed time</w:t>
       </w:r>
     </w:p>
     <w:p>
       <w:pPr>
         <w:spacing w:after="0"/>
-      </w:pPr>
-      <w:r>
+        <w:rPr>
+          <w:sz w:val="20"/>
+          <w:szCs w:val="20"/>
+        </w:rPr>
+      </w:pPr>
+      <w:r>
+        <w:rPr>
+          <w:sz w:val="20"/>
+          <w:szCs w:val="20"/>
+        </w:rPr>
         <w:t>- WIP starts at 0 and evolves over time</w:t>
       </w:r>
     </w:p>
     <w:p>
       <w:pPr>
         <w:spacing w:after="0"/>
-      </w:pPr>
-      <w:r>
+        <w:rPr>
+          <w:sz w:val="20"/>
+          <w:szCs w:val="20"/>
+        </w:rPr>
+      </w:pPr>
+      <w:r>
+        <w:rPr>
+          <w:sz w:val="20"/>
+          <w:szCs w:val="20"/>
+        </w:rPr>
         <w:t>- speed controls x1/x2/x5</w:t>
       </w:r>
     </w:p>
     <w:p>
       <w:pPr>
         <w:spacing w:after="0"/>
-      </w:pPr>
-      <w:r>
+        <w:rPr>
+          <w:sz w:val="20"/>
+          <w:szCs w:val="20"/>
+        </w:rPr>
+      </w:pPr>
+      <w:r>
+        <w:rPr>
+          <w:sz w:val="20"/>
+          <w:szCs w:val="20"/>
+        </w:rPr>
         <w:t>- Start/Pause/Reset controls</w:t>
       </w:r>
     </w:p>
     <w:p>
       <w:pPr>
         <w:spacing w:after="0"/>
-      </w:pPr>
-      <w:r>
+        <w:rPr>
+          <w:sz w:val="20"/>
+          <w:szCs w:val="20"/>
+        </w:rPr>
+      </w:pPr>
+      <w:r>
+        <w:rPr>
+          <w:sz w:val="20"/>
+          <w:szCs w:val="20"/>
+        </w:rPr>
         <w:t xml:space="preserve">- </w:t>
       </w:r>
       <w:proofErr w:type="gramStart"/>
       <w:r>
+        <w:rPr>
+          <w:sz w:val="20"/>
+          <w:szCs w:val="20"/>
+        </w:rPr>
         <w:t>instant</w:t>
       </w:r>
       <w:proofErr w:type="gramEnd"/>
       <w:r>
+        <w:rPr>
+          <w:sz w:val="20"/>
+          <w:szCs w:val="20"/>
+        </w:rPr>
         <w:t xml:space="preserve"> recompute on committed parameter changes</w:t>
       </w:r>
     </w:p>
     <w:p>
       <w:pPr>
         <w:spacing w:after="0"/>
-      </w:pPr>
-    </w:p>
-    <w:p>
-      <w:pPr>
-        <w:spacing w:after="0"/>
-      </w:pPr>
-      <w:r>
+        <w:rPr>
+          <w:sz w:val="20"/>
+          <w:szCs w:val="20"/>
+        </w:rPr>
+      </w:pPr>
+    </w:p>
+    <w:p>
+      <w:pPr>
+        <w:spacing w:after="0"/>
+        <w:rPr>
+          <w:sz w:val="20"/>
+          <w:szCs w:val="20"/>
+        </w:rPr>
+      </w:pPr>
+      <w:r>
+        <w:rPr>
+          <w:sz w:val="20"/>
+          <w:szCs w:val="20"/>
+        </w:rPr>
         <w:t>PHASE 5 — Operational Diagnosis</w:t>
       </w:r>
     </w:p>
     <w:p>
       <w:pPr>
         <w:spacing w:after="0"/>
-      </w:pPr>
-      <w:r>
+        <w:rPr>
+          <w:sz w:val="20"/>
+          <w:szCs w:val="20"/>
+        </w:rPr>
+      </w:pPr>
+      <w:r>
+        <w:rPr>
+          <w:sz w:val="20"/>
+          <w:szCs w:val="20"/>
+        </w:rPr>
         <w:t>Run the Operational Diagnosis skill immediately after simulation/forecast results are generated and before reporting/export.</w:t>
       </w:r>
     </w:p>
     <w:p>
       <w:pPr>
         <w:spacing w:after="0"/>
-      </w:pPr>
-      <w:r>
+        <w:rPr>
+          <w:sz w:val="20"/>
+          <w:szCs w:val="20"/>
+        </w:rPr>
+      </w:pPr>
+      <w:r>
+        <w:rPr>
+          <w:sz w:val="20"/>
+          <w:szCs w:val="20"/>
+        </w:rPr>
         <w:t>Generate:</w:t>
       </w:r>
     </w:p>
     <w:p>
       <w:pPr>
         <w:spacing w:after="0"/>
-      </w:pPr>
-      <w:r>
+        <w:rPr>
+          <w:sz w:val="20"/>
+          <w:szCs w:val="20"/>
+        </w:rPr>
+      </w:pPr>
+      <w:r>
+        <w:rPr>
+          <w:sz w:val="20"/>
+          <w:szCs w:val="20"/>
+        </w:rPr>
         <w:t>- models/active/</w:t>
       </w:r>
       <w:proofErr w:type="spellStart"/>
       <w:r>
+        <w:rPr>
+          <w:sz w:val="20"/>
+          <w:szCs w:val="20"/>
+        </w:rPr>
         <w:t>operational_diagnosis.json</w:t>
       </w:r>
       <w:proofErr w:type="spellEnd"/>
@@ -814,196 +1437,374 @@
     <w:p>
       <w:pPr>
         <w:spacing w:after="0"/>
-      </w:pPr>
-      <w:r>
+        <w:rPr>
+          <w:sz w:val="20"/>
+          <w:szCs w:val="20"/>
+        </w:rPr>
+      </w:pPr>
+      <w:r>
+        <w:rPr>
+          <w:sz w:val="20"/>
+          <w:szCs w:val="20"/>
+        </w:rPr>
         <w:t>- models/active/operational_diagnosis.md</w:t>
       </w:r>
     </w:p>
     <w:p>
       <w:pPr>
         <w:spacing w:after="0"/>
-      </w:pPr>
-    </w:p>
-    <w:p>
-      <w:pPr>
-        <w:spacing w:after="0"/>
-      </w:pPr>
-      <w:r>
+        <w:rPr>
+          <w:sz w:val="20"/>
+          <w:szCs w:val="20"/>
+        </w:rPr>
+      </w:pPr>
+    </w:p>
+    <w:p>
+      <w:pPr>
+        <w:spacing w:after="0"/>
+        <w:rPr>
+          <w:sz w:val="20"/>
+          <w:szCs w:val="20"/>
+        </w:rPr>
+      </w:pPr>
+      <w:r>
+        <w:rPr>
+          <w:sz w:val="20"/>
+          <w:szCs w:val="20"/>
+        </w:rPr>
         <w:t>Requirements:</w:t>
       </w:r>
     </w:p>
     <w:p>
       <w:pPr>
         <w:spacing w:after="0"/>
-      </w:pPr>
-      <w:r>
+        <w:rPr>
+          <w:sz w:val="20"/>
+          <w:szCs w:val="20"/>
+        </w:rPr>
+      </w:pPr>
+      <w:r>
+        <w:rPr>
+          <w:sz w:val="20"/>
+          <w:szCs w:val="20"/>
+        </w:rPr>
         <w:t>- do not just restate metrics</w:t>
       </w:r>
     </w:p>
     <w:p>
       <w:pPr>
         <w:spacing w:after="0"/>
-      </w:pPr>
-      <w:r>
+        <w:rPr>
+          <w:sz w:val="20"/>
+          <w:szCs w:val="20"/>
+        </w:rPr>
+      </w:pPr>
+      <w:r>
+        <w:rPr>
+          <w:sz w:val="20"/>
+          <w:szCs w:val="20"/>
+        </w:rPr>
         <w:t>- explain what is breaking, why, downstream effects, stabilizing action, and business impact</w:t>
       </w:r>
     </w:p>
     <w:p>
       <w:pPr>
         <w:spacing w:after="0"/>
-      </w:pPr>
-      <w:r>
+        <w:rPr>
+          <w:sz w:val="20"/>
+          <w:szCs w:val="20"/>
+        </w:rPr>
+      </w:pPr>
+      <w:r>
+        <w:rPr>
+          <w:sz w:val="20"/>
+          <w:szCs w:val="20"/>
+        </w:rPr>
         <w:t>- include the AI Opportunity Lens</w:t>
       </w:r>
     </w:p>
     <w:p>
       <w:pPr>
         <w:spacing w:after="0"/>
-      </w:pPr>
-      <w:r>
+        <w:rPr>
+          <w:sz w:val="20"/>
+          <w:szCs w:val="20"/>
+        </w:rPr>
+      </w:pPr>
+      <w:r>
+        <w:rPr>
+          <w:sz w:val="20"/>
+          <w:szCs w:val="20"/>
+        </w:rPr>
         <w:t>- state confidence and missing fields if data is incomplete</w:t>
       </w:r>
     </w:p>
     <w:p>
       <w:pPr>
         <w:spacing w:after="0"/>
-      </w:pPr>
-    </w:p>
-    <w:p>
-      <w:pPr>
-        <w:spacing w:after="0"/>
-      </w:pPr>
-      <w:r>
+        <w:rPr>
+          <w:sz w:val="20"/>
+          <w:szCs w:val="20"/>
+        </w:rPr>
+      </w:pPr>
+    </w:p>
+    <w:p>
+      <w:pPr>
+        <w:spacing w:after="0"/>
+        <w:rPr>
+          <w:sz w:val="20"/>
+          <w:szCs w:val="20"/>
+        </w:rPr>
+      </w:pPr>
+      <w:r>
+        <w:rPr>
+          <w:sz w:val="20"/>
+          <w:szCs w:val="20"/>
+        </w:rPr>
         <w:t>PHASE 6 — Export</w:t>
       </w:r>
     </w:p>
     <w:p>
       <w:pPr>
         <w:spacing w:after="0"/>
-      </w:pPr>
-      <w:r>
+        <w:rPr>
+          <w:sz w:val="20"/>
+          <w:szCs w:val="20"/>
+        </w:rPr>
+      </w:pPr>
+      <w:r>
+        <w:rPr>
+          <w:sz w:val="20"/>
+          <w:szCs w:val="20"/>
+        </w:rPr>
         <w:t>Export the accepted scenario bundle including:</w:t>
       </w:r>
     </w:p>
     <w:p>
       <w:pPr>
         <w:spacing w:after="0"/>
-      </w:pPr>
-      <w:r>
+        <w:rPr>
+          <w:sz w:val="20"/>
+          <w:szCs w:val="20"/>
+        </w:rPr>
+      </w:pPr>
+      <w:r>
+        <w:rPr>
+          <w:sz w:val="20"/>
+          <w:szCs w:val="20"/>
+        </w:rPr>
         <w:t>- committed scenario</w:t>
       </w:r>
     </w:p>
     <w:p>
       <w:pPr>
         <w:spacing w:after="0"/>
-      </w:pPr>
-      <w:r>
+        <w:rPr>
+          <w:sz w:val="20"/>
+          <w:szCs w:val="20"/>
+        </w:rPr>
+      </w:pPr>
+      <w:r>
+        <w:rPr>
+          <w:sz w:val="20"/>
+          <w:szCs w:val="20"/>
+        </w:rPr>
         <w:t>- result metrics</w:t>
       </w:r>
     </w:p>
     <w:p>
       <w:pPr>
         <w:spacing w:after="0"/>
-      </w:pPr>
-      <w:r>
+        <w:rPr>
+          <w:sz w:val="20"/>
+          <w:szCs w:val="20"/>
+        </w:rPr>
+      </w:pPr>
+      <w:r>
+        <w:rPr>
+          <w:sz w:val="20"/>
+          <w:szCs w:val="20"/>
+        </w:rPr>
         <w:t>- operational diagnosis</w:t>
       </w:r>
     </w:p>
     <w:p>
       <w:pPr>
         <w:spacing w:after="0"/>
-      </w:pPr>
-      <w:r>
+        <w:rPr>
+          <w:sz w:val="20"/>
+          <w:szCs w:val="20"/>
+        </w:rPr>
+      </w:pPr>
+      <w:r>
+        <w:rPr>
+          <w:sz w:val="20"/>
+          <w:szCs w:val="20"/>
+        </w:rPr>
         <w:t>- browser snapshot</w:t>
       </w:r>
     </w:p>
     <w:p>
       <w:pPr>
         <w:spacing w:after="0"/>
-      </w:pPr>
-      <w:r>
+        <w:rPr>
+          <w:sz w:val="20"/>
+          <w:szCs w:val="20"/>
+        </w:rPr>
+      </w:pPr>
+      <w:r>
+        <w:rPr>
+          <w:sz w:val="20"/>
+          <w:szCs w:val="20"/>
+        </w:rPr>
         <w:t>- full app package if supported</w:t>
       </w:r>
     </w:p>
     <w:p>
       <w:pPr>
         <w:spacing w:after="0"/>
-      </w:pPr>
-    </w:p>
-    <w:p>
-      <w:pPr>
-        <w:spacing w:after="0"/>
-      </w:pPr>
-      <w:r>
+        <w:rPr>
+          <w:sz w:val="20"/>
+          <w:szCs w:val="20"/>
+        </w:rPr>
+      </w:pPr>
+    </w:p>
+    <w:p>
+      <w:pPr>
+        <w:spacing w:after="0"/>
+        <w:rPr>
+          <w:sz w:val="20"/>
+          <w:szCs w:val="20"/>
+        </w:rPr>
+      </w:pPr>
+      <w:r>
+        <w:rPr>
+          <w:sz w:val="20"/>
+          <w:szCs w:val="20"/>
+        </w:rPr>
         <w:t xml:space="preserve">Final </w:t>
       </w:r>
       <w:proofErr w:type="gramStart"/>
       <w:r>
+        <w:rPr>
+          <w:sz w:val="20"/>
+          <w:szCs w:val="20"/>
+        </w:rPr>
         <w:t>deliverables</w:t>
       </w:r>
       <w:proofErr w:type="gramEnd"/>
       <w:r>
+        <w:rPr>
+          <w:sz w:val="20"/>
+          <w:szCs w:val="20"/>
+        </w:rPr>
         <w:t>:</w:t>
       </w:r>
     </w:p>
     <w:p>
       <w:pPr>
         <w:spacing w:after="0"/>
-      </w:pPr>
-      <w:r>
+        <w:rPr>
+          <w:sz w:val="20"/>
+          <w:szCs w:val="20"/>
+        </w:rPr>
+      </w:pPr>
+      <w:r>
+        <w:rPr>
+          <w:sz w:val="20"/>
+          <w:szCs w:val="20"/>
+        </w:rPr>
         <w:t>- working app</w:t>
       </w:r>
     </w:p>
     <w:p>
       <w:pPr>
         <w:spacing w:after="0"/>
-      </w:pPr>
-      <w:r>
-        <w:lastRenderedPageBreak/>
+        <w:rPr>
+          <w:sz w:val="20"/>
+          <w:szCs w:val="20"/>
+        </w:rPr>
+      </w:pPr>
+      <w:r>
+        <w:rPr>
+          <w:sz w:val="20"/>
+          <w:szCs w:val="20"/>
+        </w:rPr>
         <w:t>- operational diagnosis</w:t>
       </w:r>
     </w:p>
     <w:p>
       <w:pPr>
         <w:spacing w:after="0"/>
-      </w:pPr>
-      <w:r>
+        <w:rPr>
+          <w:sz w:val="20"/>
+          <w:szCs w:val="20"/>
+        </w:rPr>
+      </w:pPr>
+      <w:r>
+        <w:rPr>
+          <w:sz w:val="20"/>
+          <w:szCs w:val="20"/>
+        </w:rPr>
         <w:t>- export bundle path</w:t>
       </w:r>
     </w:p>
     <w:p>
       <w:pPr>
         <w:spacing w:after="0"/>
-      </w:pPr>
-      <w:r>
+        <w:rPr>
+          <w:sz w:val="20"/>
+          <w:szCs w:val="20"/>
+        </w:rPr>
+      </w:pPr>
+      <w:r>
+        <w:rPr>
+          <w:sz w:val="20"/>
+          <w:szCs w:val="20"/>
+        </w:rPr>
         <w:t>- short final summary of system status, active bottleneck, and recommended intervention</w:t>
       </w:r>
     </w:p>
     <w:p>
       <w:pPr>
         <w:spacing w:after="0"/>
-      </w:pPr>
-    </w:p>
-    <w:p>
-      <w:pPr>
-        <w:spacing w:after="0"/>
-      </w:pPr>
-      <w:r>
+        <w:rPr>
+          <w:sz w:val="20"/>
+          <w:szCs w:val="20"/>
+        </w:rPr>
+      </w:pPr>
+    </w:p>
+    <w:p>
+      <w:pPr>
+        <w:spacing w:after="0"/>
+        <w:rPr>
+          <w:sz w:val="20"/>
+          <w:szCs w:val="20"/>
+        </w:rPr>
+      </w:pPr>
+      <w:r>
+        <w:rPr>
+          <w:sz w:val="20"/>
+          <w:szCs w:val="20"/>
+        </w:rPr>
         <w:t>Verification:</w:t>
       </w:r>
     </w:p>
     <w:p>
       <w:pPr>
         <w:spacing w:after="0"/>
-      </w:pPr>
-      <w:r>
+        <w:rPr>
+          <w:sz w:val="20"/>
+          <w:szCs w:val="20"/>
+        </w:rPr>
+      </w:pPr>
+      <w:r>
+        <w:rPr>
+          <w:sz w:val="20"/>
+          <w:szCs w:val="20"/>
+        </w:rPr>
         <w:t>Run the relevant build/validation/export commands and report what passed and what was not run.</w:t>
       </w:r>
-    </w:p>
-    <w:p>
-      <w:pPr>
-        <w:spacing w:after="0"/>
-      </w:pPr>
     </w:p>
     <w:p>
       <w:pPr>
@@ -1023,6 +1824,2381 @@
           <w:b/>
           <w:bCs/>
         </w:rPr>
+        <w:t>PROMP #1 B</w:t>
+      </w:r>
+    </w:p>
+    <w:p>
+      <w:pPr>
+        <w:spacing w:after="0"/>
+        <w:rPr>
+          <w:sz w:val="22"/>
+          <w:szCs w:val="22"/>
+        </w:rPr>
+      </w:pPr>
+      <w:r>
+        <w:rPr>
+          <w:sz w:val="22"/>
+          <w:szCs w:val="22"/>
+        </w:rPr>
+        <w:t>Run the full VSM-to-Simulation workflow for this repo template.</w:t>
+      </w:r>
+    </w:p>
+    <w:p>
+      <w:pPr>
+        <w:spacing w:after="0"/>
+        <w:rPr>
+          <w:sz w:val="22"/>
+          <w:szCs w:val="22"/>
+        </w:rPr>
+      </w:pPr>
+    </w:p>
+    <w:p>
+      <w:pPr>
+        <w:spacing w:after="0"/>
+        <w:rPr>
+          <w:sz w:val="22"/>
+          <w:szCs w:val="22"/>
+        </w:rPr>
+      </w:pPr>
+      <w:r>
+        <w:rPr>
+          <w:sz w:val="22"/>
+          <w:szCs w:val="22"/>
+        </w:rPr>
+        <w:t>Context:</w:t>
+      </w:r>
+    </w:p>
+    <w:p>
+      <w:pPr>
+        <w:spacing w:after="0"/>
+        <w:rPr>
+          <w:sz w:val="22"/>
+          <w:szCs w:val="22"/>
+        </w:rPr>
+      </w:pPr>
+      <w:r>
+        <w:rPr>
+          <w:sz w:val="22"/>
+          <w:szCs w:val="22"/>
+        </w:rPr>
+        <w:t>This repo is a TEMPLATE for a bottleneck forecasting simulator.</w:t>
+      </w:r>
+    </w:p>
+    <w:p>
+      <w:pPr>
+        <w:spacing w:after="0"/>
+        <w:rPr>
+          <w:sz w:val="22"/>
+          <w:szCs w:val="22"/>
+        </w:rPr>
+      </w:pPr>
+      <w:r>
+        <w:rPr>
+          <w:sz w:val="22"/>
+          <w:szCs w:val="22"/>
+        </w:rPr>
+        <w:t>Goal: build a deterministic non-DES forecast model from the attached VSM image(s), then wire the simulator UI, generate diagnosis, and prepare export artifacts.</w:t>
+      </w:r>
+    </w:p>
+    <w:p>
+      <w:pPr>
+        <w:spacing w:after="0"/>
+        <w:rPr>
+          <w:sz w:val="22"/>
+          <w:szCs w:val="22"/>
+        </w:rPr>
+      </w:pPr>
+    </w:p>
+    <w:p>
+      <w:pPr>
+        <w:spacing w:after="0"/>
+        <w:rPr>
+          <w:sz w:val="22"/>
+          <w:szCs w:val="22"/>
+        </w:rPr>
+      </w:pPr>
+      <w:r>
+        <w:rPr>
+          <w:sz w:val="22"/>
+          <w:szCs w:val="22"/>
+        </w:rPr>
+        <w:t>Source of truth:</w:t>
+      </w:r>
+    </w:p>
+    <w:p>
+      <w:pPr>
+        <w:spacing w:after="0"/>
+        <w:rPr>
+          <w:sz w:val="22"/>
+          <w:szCs w:val="22"/>
+        </w:rPr>
+      </w:pPr>
+      <w:r>
+        <w:rPr>
+          <w:sz w:val="22"/>
+          <w:szCs w:val="22"/>
+        </w:rPr>
+        <w:t>- Use only visible values from the attached VSM image(s)</w:t>
+      </w:r>
+    </w:p>
+    <w:p>
+      <w:pPr>
+        <w:spacing w:after="0"/>
+        <w:rPr>
+          <w:sz w:val="22"/>
+          <w:szCs w:val="22"/>
+        </w:rPr>
+      </w:pPr>
+      <w:r>
+        <w:rPr>
+          <w:sz w:val="22"/>
+          <w:szCs w:val="22"/>
+        </w:rPr>
+        <w:t>- Do not invent missing values</w:t>
+      </w:r>
+    </w:p>
+    <w:p>
+      <w:pPr>
+        <w:spacing w:after="0"/>
+        <w:rPr>
+          <w:sz w:val="22"/>
+          <w:szCs w:val="22"/>
+        </w:rPr>
+      </w:pPr>
+      <w:r>
+        <w:rPr>
+          <w:sz w:val="22"/>
+          <w:szCs w:val="22"/>
+        </w:rPr>
+        <w:t>- If a value is unreadable or ambiguous, set it to `null` and document it</w:t>
+      </w:r>
+    </w:p>
+    <w:p>
+      <w:pPr>
+        <w:spacing w:after="0"/>
+        <w:rPr>
+          <w:sz w:val="22"/>
+          <w:szCs w:val="22"/>
+        </w:rPr>
+      </w:pPr>
+    </w:p>
+    <w:p>
+      <w:pPr>
+        <w:spacing w:after="0"/>
+        <w:rPr>
+          <w:sz w:val="22"/>
+          <w:szCs w:val="22"/>
+        </w:rPr>
+      </w:pPr>
+      <w:r>
+        <w:rPr>
+          <w:sz w:val="22"/>
+          <w:szCs w:val="22"/>
+        </w:rPr>
+        <w:lastRenderedPageBreak/>
+        <w:t>Execution mode:</w:t>
+      </w:r>
+    </w:p>
+    <w:p>
+      <w:pPr>
+        <w:spacing w:after="0"/>
+        <w:rPr>
+          <w:sz w:val="22"/>
+          <w:szCs w:val="22"/>
+        </w:rPr>
+      </w:pPr>
+      <w:r>
+        <w:rPr>
+          <w:sz w:val="22"/>
+          <w:szCs w:val="22"/>
+        </w:rPr>
+        <w:t>Run in phases and continue automatically unless a real blocker appears.</w:t>
+      </w:r>
+    </w:p>
+    <w:p>
+      <w:pPr>
+        <w:spacing w:after="0"/>
+        <w:rPr>
+          <w:sz w:val="22"/>
+          <w:szCs w:val="22"/>
+        </w:rPr>
+      </w:pPr>
+      <w:r>
+        <w:rPr>
+          <w:sz w:val="22"/>
+          <w:szCs w:val="22"/>
+        </w:rPr>
+        <w:t>After each phase, print:</w:t>
+      </w:r>
+    </w:p>
+    <w:p>
+      <w:pPr>
+        <w:spacing w:after="0"/>
+        <w:rPr>
+          <w:sz w:val="22"/>
+          <w:szCs w:val="22"/>
+        </w:rPr>
+      </w:pPr>
+      <w:r>
+        <w:rPr>
+          <w:sz w:val="22"/>
+          <w:szCs w:val="22"/>
+        </w:rPr>
+        <w:t>1. short summary</w:t>
+      </w:r>
+    </w:p>
+    <w:p>
+      <w:pPr>
+        <w:spacing w:after="0"/>
+        <w:rPr>
+          <w:sz w:val="22"/>
+          <w:szCs w:val="22"/>
+        </w:rPr>
+      </w:pPr>
+      <w:r>
+        <w:rPr>
+          <w:sz w:val="22"/>
+          <w:szCs w:val="22"/>
+        </w:rPr>
+        <w:t>2. files changed</w:t>
+      </w:r>
+    </w:p>
+    <w:p>
+      <w:pPr>
+        <w:spacing w:after="0"/>
+        <w:rPr>
+          <w:sz w:val="22"/>
+          <w:szCs w:val="22"/>
+        </w:rPr>
+      </w:pPr>
+    </w:p>
+    <w:p>
+      <w:pPr>
+        <w:spacing w:after="0"/>
+        <w:rPr>
+          <w:sz w:val="22"/>
+          <w:szCs w:val="22"/>
+        </w:rPr>
+      </w:pPr>
+      <w:r>
+        <w:rPr>
+          <w:sz w:val="22"/>
+          <w:szCs w:val="22"/>
+        </w:rPr>
+        <w:t>Stop and ask only if:</w:t>
+      </w:r>
+    </w:p>
+    <w:p>
+      <w:pPr>
+        <w:spacing w:after="0"/>
+        <w:rPr>
+          <w:sz w:val="22"/>
+          <w:szCs w:val="22"/>
+        </w:rPr>
+      </w:pPr>
+      <w:r>
+        <w:rPr>
+          <w:sz w:val="22"/>
+          <w:szCs w:val="22"/>
+        </w:rPr>
+        <w:t xml:space="preserve">- required input is </w:t>
+      </w:r>
+      <w:proofErr w:type="gramStart"/>
+      <w:r>
+        <w:rPr>
+          <w:sz w:val="22"/>
+          <w:szCs w:val="22"/>
+        </w:rPr>
+        <w:t>missing, or</w:t>
+      </w:r>
+      <w:proofErr w:type="gramEnd"/>
+      <w:r>
+        <w:rPr>
+          <w:sz w:val="22"/>
+          <w:szCs w:val="22"/>
+        </w:rPr>
+        <w:t xml:space="preserve"> cannot be assumed as 0.</w:t>
+      </w:r>
+    </w:p>
+    <w:p>
+      <w:pPr>
+        <w:spacing w:after="0"/>
+        <w:rPr>
+          <w:sz w:val="22"/>
+          <w:szCs w:val="22"/>
+        </w:rPr>
+      </w:pPr>
+      <w:r>
+        <w:rPr>
+          <w:sz w:val="22"/>
+          <w:szCs w:val="22"/>
+        </w:rPr>
+        <w:t>- a visible value is materially ambiguous</w:t>
+      </w:r>
+    </w:p>
+    <w:p>
+      <w:pPr>
+        <w:spacing w:after="0"/>
+        <w:rPr>
+          <w:sz w:val="22"/>
+          <w:szCs w:val="22"/>
+        </w:rPr>
+      </w:pPr>
+      <w:r>
+        <w:rPr>
+          <w:sz w:val="22"/>
+          <w:szCs w:val="22"/>
+        </w:rPr>
+        <w:t>- a new dependency would be required</w:t>
+      </w:r>
+    </w:p>
+    <w:p>
+      <w:pPr>
+        <w:spacing w:after="0"/>
+        <w:rPr>
+          <w:sz w:val="22"/>
+          <w:szCs w:val="22"/>
+        </w:rPr>
+      </w:pPr>
+      <w:r>
+        <w:rPr>
+          <w:sz w:val="22"/>
+          <w:szCs w:val="22"/>
+        </w:rPr>
+        <w:t>- an action would be risky or destructive</w:t>
+      </w:r>
+    </w:p>
+    <w:p>
+      <w:pPr>
+        <w:spacing w:after="0"/>
+        <w:rPr>
+          <w:sz w:val="22"/>
+          <w:szCs w:val="22"/>
+        </w:rPr>
+      </w:pPr>
+    </w:p>
+    <w:p>
+      <w:pPr>
+        <w:spacing w:after="0"/>
+        <w:rPr>
+          <w:sz w:val="22"/>
+          <w:szCs w:val="22"/>
+        </w:rPr>
+      </w:pPr>
+      <w:r>
+        <w:rPr>
+          <w:sz w:val="22"/>
+          <w:szCs w:val="22"/>
+        </w:rPr>
+        <w:t>Hard constraints:</w:t>
+      </w:r>
+    </w:p>
+    <w:p>
+      <w:pPr>
+        <w:spacing w:after="0"/>
+        <w:rPr>
+          <w:sz w:val="22"/>
+          <w:szCs w:val="22"/>
+        </w:rPr>
+      </w:pPr>
+      <w:r>
+        <w:rPr>
+          <w:sz w:val="22"/>
+          <w:szCs w:val="22"/>
+        </w:rPr>
+        <w:t>- Do NOT rename, merge, reorder, or simplify VSM process steps</w:t>
+      </w:r>
+    </w:p>
+    <w:p>
+      <w:pPr>
+        <w:spacing w:after="0"/>
+        <w:rPr>
+          <w:sz w:val="22"/>
+          <w:szCs w:val="22"/>
+        </w:rPr>
+      </w:pPr>
+      <w:r>
+        <w:rPr>
+          <w:sz w:val="22"/>
+          <w:szCs w:val="22"/>
+        </w:rPr>
+        <w:t>- Preserve step names EXACTLY as shown</w:t>
+      </w:r>
+    </w:p>
+    <w:p>
+      <w:pPr>
+        <w:spacing w:after="0"/>
+        <w:rPr>
+          <w:sz w:val="22"/>
+          <w:szCs w:val="22"/>
+        </w:rPr>
+      </w:pPr>
+      <w:r>
+        <w:rPr>
+          <w:sz w:val="22"/>
+          <w:szCs w:val="22"/>
+        </w:rPr>
+        <w:t>- Preserve left-to-right sequence EXACTLY</w:t>
+      </w:r>
+    </w:p>
+    <w:p>
+      <w:pPr>
+        <w:spacing w:after="0"/>
+        <w:rPr>
+          <w:sz w:val="22"/>
+          <w:szCs w:val="22"/>
+        </w:rPr>
+      </w:pPr>
+      <w:r>
+        <w:rPr>
+          <w:sz w:val="22"/>
+          <w:szCs w:val="22"/>
+        </w:rPr>
+        <w:t>- Keep layout structure fixed: left params, top KPIs, center canvas</w:t>
+      </w:r>
+    </w:p>
+    <w:p>
+      <w:pPr>
+        <w:spacing w:after="0"/>
+        <w:rPr>
+          <w:sz w:val="22"/>
+          <w:szCs w:val="22"/>
+        </w:rPr>
+      </w:pPr>
+      <w:r>
+        <w:rPr>
+          <w:sz w:val="22"/>
+          <w:szCs w:val="22"/>
+        </w:rPr>
+        <w:t>- Keep this as a non-DES forecast simulator unless I explicitly request DES</w:t>
+      </w:r>
+    </w:p>
+    <w:p>
+      <w:pPr>
+        <w:spacing w:after="0"/>
+        <w:rPr>
+          <w:sz w:val="22"/>
+          <w:szCs w:val="22"/>
+        </w:rPr>
+      </w:pPr>
+      <w:r>
+        <w:rPr>
+          <w:sz w:val="22"/>
+          <w:szCs w:val="22"/>
+        </w:rPr>
+        <w:t>- Do not add dependencies without asking once</w:t>
+      </w:r>
+    </w:p>
+    <w:p>
+      <w:pPr>
+        <w:spacing w:after="0"/>
+        <w:rPr>
+          <w:sz w:val="22"/>
+          <w:szCs w:val="22"/>
+        </w:rPr>
+      </w:pPr>
+    </w:p>
+    <w:p>
+      <w:pPr>
+        <w:spacing w:after="0"/>
+        <w:rPr>
+          <w:sz w:val="22"/>
+          <w:szCs w:val="22"/>
+        </w:rPr>
+      </w:pPr>
+      <w:r>
+        <w:rPr>
+          <w:sz w:val="22"/>
+          <w:szCs w:val="22"/>
+        </w:rPr>
+        <w:t>PHASE 1 — Strict VSM transcription</w:t>
+      </w:r>
+    </w:p>
+    <w:p>
+      <w:pPr>
+        <w:spacing w:after="0"/>
+        <w:rPr>
+          <w:sz w:val="22"/>
+          <w:szCs w:val="22"/>
+        </w:rPr>
+      </w:pPr>
+      <w:r>
+        <w:rPr>
+          <w:sz w:val="22"/>
+          <w:szCs w:val="22"/>
+        </w:rPr>
+        <w:t>Use skill: `</w:t>
+      </w:r>
+      <w:proofErr w:type="spellStart"/>
+      <w:r>
+        <w:rPr>
+          <w:sz w:val="22"/>
+          <w:szCs w:val="22"/>
+        </w:rPr>
+        <w:t>vsm</w:t>
+      </w:r>
+      <w:proofErr w:type="spellEnd"/>
+      <w:r>
+        <w:rPr>
+          <w:sz w:val="22"/>
+          <w:szCs w:val="22"/>
+        </w:rPr>
+        <w:t>-to-sim-model`</w:t>
+      </w:r>
+    </w:p>
+    <w:p>
+      <w:pPr>
+        <w:spacing w:after="0"/>
+        <w:rPr>
+          <w:sz w:val="22"/>
+          <w:szCs w:val="22"/>
+        </w:rPr>
+      </w:pPr>
+      <w:r>
+        <w:rPr>
+          <w:sz w:val="22"/>
+          <w:szCs w:val="22"/>
+        </w:rPr>
+        <w:t>Create:</w:t>
+      </w:r>
+    </w:p>
+    <w:p>
+      <w:pPr>
+        <w:spacing w:after="0"/>
+        <w:rPr>
+          <w:sz w:val="22"/>
+          <w:szCs w:val="22"/>
+        </w:rPr>
+      </w:pPr>
+      <w:r>
+        <w:rPr>
+          <w:sz w:val="22"/>
+          <w:szCs w:val="22"/>
+        </w:rPr>
+        <w:t>- `models/active/</w:t>
+      </w:r>
+      <w:proofErr w:type="spellStart"/>
+      <w:r>
+        <w:rPr>
+          <w:sz w:val="22"/>
+          <w:szCs w:val="22"/>
+        </w:rPr>
+        <w:t>vsm_graph.json</w:t>
+      </w:r>
+      <w:proofErr w:type="spellEnd"/>
+      <w:r>
+        <w:rPr>
+          <w:sz w:val="22"/>
+          <w:szCs w:val="22"/>
+        </w:rPr>
+        <w:t>`</w:t>
+      </w:r>
+    </w:p>
+    <w:p>
+      <w:pPr>
+        <w:spacing w:after="0"/>
+        <w:rPr>
+          <w:sz w:val="22"/>
+          <w:szCs w:val="22"/>
+        </w:rPr>
+      </w:pPr>
+      <w:r>
+        <w:rPr>
+          <w:sz w:val="22"/>
+          <w:szCs w:val="22"/>
+        </w:rPr>
+        <w:t>- `models/active/</w:t>
+      </w:r>
+      <w:proofErr w:type="spellStart"/>
+      <w:r>
+        <w:rPr>
+          <w:sz w:val="22"/>
+          <w:szCs w:val="22"/>
+        </w:rPr>
+        <w:t>master_data.json</w:t>
+      </w:r>
+      <w:proofErr w:type="spellEnd"/>
+      <w:r>
+        <w:rPr>
+          <w:sz w:val="22"/>
+          <w:szCs w:val="22"/>
+        </w:rPr>
+        <w:t>`</w:t>
+      </w:r>
+    </w:p>
+    <w:p>
+      <w:pPr>
+        <w:spacing w:after="0"/>
+        <w:rPr>
+          <w:sz w:val="22"/>
+          <w:szCs w:val="22"/>
+        </w:rPr>
+      </w:pPr>
+      <w:r>
+        <w:rPr>
+          <w:sz w:val="22"/>
+          <w:szCs w:val="22"/>
+        </w:rPr>
+        <w:t>- `models/missing_data_report.md`</w:t>
+      </w:r>
+    </w:p>
+    <w:p>
+      <w:pPr>
+        <w:spacing w:after="0"/>
+        <w:rPr>
+          <w:sz w:val="22"/>
+          <w:szCs w:val="22"/>
+        </w:rPr>
+      </w:pPr>
+    </w:p>
+    <w:p>
+      <w:pPr>
+        <w:spacing w:after="0"/>
+        <w:rPr>
+          <w:sz w:val="22"/>
+          <w:szCs w:val="22"/>
+        </w:rPr>
+      </w:pPr>
+      <w:r>
+        <w:rPr>
+          <w:sz w:val="22"/>
+          <w:szCs w:val="22"/>
+        </w:rPr>
+        <w:t>Extract only visible:</w:t>
+      </w:r>
+    </w:p>
+    <w:p>
+      <w:pPr>
+        <w:spacing w:after="0"/>
+        <w:rPr>
+          <w:sz w:val="22"/>
+          <w:szCs w:val="22"/>
+        </w:rPr>
+      </w:pPr>
+      <w:r>
+        <w:rPr>
+          <w:sz w:val="22"/>
+          <w:szCs w:val="22"/>
+        </w:rPr>
+        <w:t>- Name of VSM</w:t>
+      </w:r>
+    </w:p>
+    <w:p>
+      <w:pPr>
+        <w:spacing w:after="0"/>
+        <w:rPr>
+          <w:sz w:val="22"/>
+          <w:szCs w:val="22"/>
+        </w:rPr>
+      </w:pPr>
+      <w:r>
+        <w:rPr>
+          <w:sz w:val="22"/>
+          <w:szCs w:val="22"/>
+        </w:rPr>
+        <w:t>- CT</w:t>
+      </w:r>
+    </w:p>
+    <w:p>
+      <w:pPr>
+        <w:spacing w:after="0"/>
+        <w:rPr>
+          <w:sz w:val="22"/>
+          <w:szCs w:val="22"/>
+        </w:rPr>
+      </w:pPr>
+      <w:r>
+        <w:rPr>
+          <w:sz w:val="22"/>
+          <w:szCs w:val="22"/>
+        </w:rPr>
+        <w:t>- C/O</w:t>
+      </w:r>
+    </w:p>
+    <w:p>
+      <w:pPr>
+        <w:spacing w:after="0"/>
+        <w:rPr>
+          <w:sz w:val="22"/>
+          <w:szCs w:val="22"/>
+        </w:rPr>
+      </w:pPr>
+      <w:r>
+        <w:rPr>
+          <w:sz w:val="22"/>
+          <w:szCs w:val="22"/>
+        </w:rPr>
+        <w:t>- waits</w:t>
+      </w:r>
+    </w:p>
+    <w:p>
+      <w:pPr>
+        <w:spacing w:after="0"/>
+        <w:rPr>
+          <w:sz w:val="22"/>
+          <w:szCs w:val="22"/>
+        </w:rPr>
+      </w:pPr>
+      <w:r>
+        <w:rPr>
+          <w:sz w:val="22"/>
+          <w:szCs w:val="22"/>
+        </w:rPr>
+        <w:t>- workers</w:t>
+      </w:r>
+    </w:p>
+    <w:p>
+      <w:pPr>
+        <w:spacing w:after="0"/>
+        <w:rPr>
+          <w:sz w:val="22"/>
+          <w:szCs w:val="22"/>
+        </w:rPr>
+      </w:pPr>
+      <w:r>
+        <w:rPr>
+          <w:sz w:val="22"/>
+          <w:szCs w:val="22"/>
+        </w:rPr>
+        <w:t>- parallel procedures</w:t>
+      </w:r>
+    </w:p>
+    <w:p>
+      <w:pPr>
+        <w:spacing w:after="0"/>
+        <w:rPr>
+          <w:sz w:val="22"/>
+          <w:szCs w:val="22"/>
+        </w:rPr>
+      </w:pPr>
+      <w:r>
+        <w:rPr>
+          <w:sz w:val="22"/>
+          <w:szCs w:val="22"/>
+        </w:rPr>
+        <w:t>- notes</w:t>
+      </w:r>
+    </w:p>
+    <w:p>
+      <w:pPr>
+        <w:spacing w:after="0"/>
+        <w:rPr>
+          <w:sz w:val="22"/>
+          <w:szCs w:val="22"/>
+        </w:rPr>
+      </w:pPr>
+    </w:p>
+    <w:p>
+      <w:pPr>
+        <w:spacing w:after="0"/>
+        <w:rPr>
+          <w:sz w:val="22"/>
+          <w:szCs w:val="22"/>
+        </w:rPr>
+      </w:pPr>
+      <w:r>
+        <w:rPr>
+          <w:sz w:val="22"/>
+          <w:szCs w:val="22"/>
+        </w:rPr>
+        <w:t>PHASE 2 — Forecast compilation</w:t>
+      </w:r>
+    </w:p>
+    <w:p>
+      <w:pPr>
+        <w:spacing w:after="0"/>
+        <w:rPr>
+          <w:sz w:val="22"/>
+          <w:szCs w:val="22"/>
+        </w:rPr>
+      </w:pPr>
+      <w:r>
+        <w:rPr>
+          <w:sz w:val="22"/>
+          <w:szCs w:val="22"/>
+        </w:rPr>
+        <w:t>Use skill: `</w:t>
+      </w:r>
+      <w:proofErr w:type="spellStart"/>
+      <w:r>
+        <w:rPr>
+          <w:sz w:val="22"/>
+          <w:szCs w:val="22"/>
+        </w:rPr>
+        <w:t>vsm</w:t>
+      </w:r>
+      <w:proofErr w:type="spellEnd"/>
+      <w:r>
+        <w:rPr>
+          <w:sz w:val="22"/>
+          <w:szCs w:val="22"/>
+        </w:rPr>
+        <w:t>-to-sim-model`</w:t>
+      </w:r>
+    </w:p>
+    <w:p>
+      <w:pPr>
+        <w:spacing w:after="0"/>
+        <w:rPr>
+          <w:sz w:val="22"/>
+          <w:szCs w:val="22"/>
+        </w:rPr>
+      </w:pPr>
+      <w:r>
+        <w:rPr>
+          <w:sz w:val="22"/>
+          <w:szCs w:val="22"/>
+        </w:rPr>
+        <w:t>Create:</w:t>
+      </w:r>
+    </w:p>
+    <w:p>
+      <w:pPr>
+        <w:spacing w:after="0"/>
+        <w:rPr>
+          <w:sz w:val="22"/>
+          <w:szCs w:val="22"/>
+        </w:rPr>
+      </w:pPr>
+      <w:r>
+        <w:rPr>
+          <w:sz w:val="22"/>
+          <w:szCs w:val="22"/>
+        </w:rPr>
+        <w:t>- `models/active/</w:t>
+      </w:r>
+      <w:proofErr w:type="spellStart"/>
+      <w:r>
+        <w:rPr>
+          <w:sz w:val="22"/>
+          <w:szCs w:val="22"/>
+        </w:rPr>
+        <w:t>compiled_forecast_model.json</w:t>
+      </w:r>
+      <w:proofErr w:type="spellEnd"/>
+      <w:r>
+        <w:rPr>
+          <w:sz w:val="22"/>
+          <w:szCs w:val="22"/>
+        </w:rPr>
+        <w:t>`</w:t>
+      </w:r>
+    </w:p>
+    <w:p>
+      <w:pPr>
+        <w:spacing w:after="0"/>
+        <w:rPr>
+          <w:sz w:val="22"/>
+          <w:szCs w:val="22"/>
+        </w:rPr>
+      </w:pPr>
+    </w:p>
+    <w:p>
+      <w:pPr>
+        <w:spacing w:after="0"/>
+        <w:rPr>
+          <w:sz w:val="22"/>
+          <w:szCs w:val="22"/>
+        </w:rPr>
+      </w:pPr>
+      <w:r>
+        <w:rPr>
+          <w:sz w:val="22"/>
+          <w:szCs w:val="22"/>
+        </w:rPr>
+        <w:lastRenderedPageBreak/>
+        <w:t>Required outputs:</w:t>
+      </w:r>
+    </w:p>
+    <w:p>
+      <w:pPr>
+        <w:spacing w:after="0"/>
+        <w:rPr>
+          <w:sz w:val="22"/>
+          <w:szCs w:val="22"/>
+        </w:rPr>
+      </w:pPr>
+      <w:r>
+        <w:rPr>
+          <w:sz w:val="22"/>
+          <w:szCs w:val="22"/>
+        </w:rPr>
+        <w:t>- per-step capacity</w:t>
+      </w:r>
+    </w:p>
+    <w:p>
+      <w:pPr>
+        <w:spacing w:after="0"/>
+        <w:rPr>
+          <w:sz w:val="22"/>
+          <w:szCs w:val="22"/>
+        </w:rPr>
+      </w:pPr>
+      <w:r>
+        <w:rPr>
+          <w:sz w:val="22"/>
+          <w:szCs w:val="22"/>
+        </w:rPr>
+        <w:t>- utilization</w:t>
+      </w:r>
+    </w:p>
+    <w:p>
+      <w:pPr>
+        <w:spacing w:after="0"/>
+        <w:rPr>
+          <w:sz w:val="22"/>
+          <w:szCs w:val="22"/>
+        </w:rPr>
+      </w:pPr>
+      <w:r>
+        <w:rPr>
+          <w:sz w:val="22"/>
+          <w:szCs w:val="22"/>
+        </w:rPr>
+        <w:t>- headroom</w:t>
+      </w:r>
+    </w:p>
+    <w:p>
+      <w:pPr>
+        <w:spacing w:after="0"/>
+        <w:rPr>
+          <w:sz w:val="22"/>
+          <w:szCs w:val="22"/>
+        </w:rPr>
+      </w:pPr>
+      <w:r>
+        <w:rPr>
+          <w:sz w:val="22"/>
+          <w:szCs w:val="22"/>
+        </w:rPr>
+        <w:t>- queue risk</w:t>
+      </w:r>
+    </w:p>
+    <w:p>
+      <w:pPr>
+        <w:spacing w:after="0"/>
+        <w:rPr>
+          <w:sz w:val="22"/>
+          <w:szCs w:val="22"/>
+        </w:rPr>
+      </w:pPr>
+      <w:r>
+        <w:rPr>
+          <w:sz w:val="22"/>
+          <w:szCs w:val="22"/>
+        </w:rPr>
+        <w:t>- bottleneck index</w:t>
+      </w:r>
+    </w:p>
+    <w:p>
+      <w:pPr>
+        <w:spacing w:after="0"/>
+        <w:rPr>
+          <w:sz w:val="22"/>
+          <w:szCs w:val="22"/>
+        </w:rPr>
+      </w:pPr>
+      <w:r>
+        <w:rPr>
+          <w:sz w:val="22"/>
+          <w:szCs w:val="22"/>
+        </w:rPr>
+        <w:t>- global throughput</w:t>
+      </w:r>
+    </w:p>
+    <w:p>
+      <w:pPr>
+        <w:spacing w:after="0"/>
+        <w:rPr>
+          <w:sz w:val="22"/>
+          <w:szCs w:val="22"/>
+        </w:rPr>
+      </w:pPr>
+      <w:r>
+        <w:rPr>
+          <w:sz w:val="22"/>
+          <w:szCs w:val="22"/>
+        </w:rPr>
+        <w:t>- brittleness</w:t>
+      </w:r>
+    </w:p>
+    <w:p>
+      <w:pPr>
+        <w:spacing w:after="0"/>
+        <w:rPr>
+          <w:sz w:val="22"/>
+          <w:szCs w:val="22"/>
+        </w:rPr>
+      </w:pPr>
+      <w:r>
+        <w:rPr>
+          <w:sz w:val="22"/>
+          <w:szCs w:val="22"/>
+        </w:rPr>
+        <w:t>- bottleneck migration</w:t>
+      </w:r>
+    </w:p>
+    <w:p>
+      <w:pPr>
+        <w:spacing w:after="0"/>
+        <w:rPr>
+          <w:sz w:val="22"/>
+          <w:szCs w:val="22"/>
+        </w:rPr>
+      </w:pPr>
+    </w:p>
+    <w:p>
+      <w:pPr>
+        <w:spacing w:after="0"/>
+        <w:rPr>
+          <w:sz w:val="22"/>
+          <w:szCs w:val="22"/>
+        </w:rPr>
+      </w:pPr>
+      <w:r>
+        <w:rPr>
+          <w:sz w:val="22"/>
+          <w:szCs w:val="22"/>
+        </w:rPr>
+        <w:t>PHASE 3 — UI wiring only</w:t>
+      </w:r>
+    </w:p>
+    <w:p>
+      <w:pPr>
+        <w:spacing w:after="0"/>
+        <w:rPr>
+          <w:sz w:val="22"/>
+          <w:szCs w:val="22"/>
+        </w:rPr>
+      </w:pPr>
+      <w:r>
+        <w:rPr>
+          <w:sz w:val="22"/>
+          <w:szCs w:val="22"/>
+        </w:rPr>
+        <w:t>Use skill: `</w:t>
+      </w:r>
+      <w:proofErr w:type="spellStart"/>
+      <w:r>
+        <w:rPr>
+          <w:sz w:val="22"/>
+          <w:szCs w:val="22"/>
+        </w:rPr>
+        <w:t>ui</w:t>
+      </w:r>
+      <w:proofErr w:type="spellEnd"/>
+      <w:r>
+        <w:rPr>
+          <w:sz w:val="22"/>
+          <w:szCs w:val="22"/>
+        </w:rPr>
+        <w:t>-sim-dashboard-shell`</w:t>
+      </w:r>
+    </w:p>
+    <w:p>
+      <w:pPr>
+        <w:spacing w:after="0"/>
+        <w:rPr>
+          <w:sz w:val="22"/>
+          <w:szCs w:val="22"/>
+        </w:rPr>
+      </w:pPr>
+    </w:p>
+    <w:p>
+      <w:pPr>
+        <w:spacing w:after="0"/>
+        <w:rPr>
+          <w:sz w:val="22"/>
+          <w:szCs w:val="22"/>
+        </w:rPr>
+      </w:pPr>
+      <w:r>
+        <w:rPr>
+          <w:sz w:val="22"/>
+          <w:szCs w:val="22"/>
+        </w:rPr>
+        <w:t>Bind:</w:t>
+      </w:r>
+    </w:p>
+    <w:p>
+      <w:pPr>
+        <w:spacing w:after="0"/>
+        <w:rPr>
+          <w:sz w:val="22"/>
+          <w:szCs w:val="22"/>
+        </w:rPr>
+      </w:pPr>
+      <w:r>
+        <w:rPr>
+          <w:sz w:val="22"/>
+          <w:szCs w:val="22"/>
+        </w:rPr>
+        <w:t>- left panel to inputs</w:t>
+      </w:r>
+    </w:p>
+    <w:p>
+      <w:pPr>
+        <w:spacing w:after="0"/>
+        <w:rPr>
+          <w:sz w:val="22"/>
+          <w:szCs w:val="22"/>
+        </w:rPr>
+      </w:pPr>
+      <w:r>
+        <w:rPr>
+          <w:sz w:val="22"/>
+          <w:szCs w:val="22"/>
+        </w:rPr>
+        <w:t>- KPI row to forecast outputs</w:t>
+      </w:r>
+    </w:p>
+    <w:p>
+      <w:pPr>
+        <w:spacing w:after="0"/>
+        <w:rPr>
+          <w:sz w:val="22"/>
+          <w:szCs w:val="22"/>
+        </w:rPr>
+      </w:pPr>
+      <w:r>
+        <w:rPr>
+          <w:sz w:val="22"/>
+          <w:szCs w:val="22"/>
+        </w:rPr>
+        <w:t>- node styling to forecast outputs</w:t>
+      </w:r>
+    </w:p>
+    <w:p>
+      <w:pPr>
+        <w:spacing w:after="0"/>
+        <w:rPr>
+          <w:sz w:val="22"/>
+          <w:szCs w:val="22"/>
+        </w:rPr>
+      </w:pPr>
+    </w:p>
+    <w:p>
+      <w:pPr>
+        <w:spacing w:after="0"/>
+        <w:rPr>
+          <w:sz w:val="22"/>
+          <w:szCs w:val="22"/>
+        </w:rPr>
+      </w:pPr>
+      <w:r>
+        <w:rPr>
+          <w:sz w:val="22"/>
+          <w:szCs w:val="22"/>
+        </w:rPr>
+        <w:t>Keep:</w:t>
+      </w:r>
+    </w:p>
+    <w:p>
+      <w:pPr>
+        <w:spacing w:after="0"/>
+        <w:rPr>
+          <w:sz w:val="22"/>
+          <w:szCs w:val="22"/>
+        </w:rPr>
+      </w:pPr>
+      <w:r>
+        <w:rPr>
+          <w:sz w:val="22"/>
+          <w:szCs w:val="22"/>
+        </w:rPr>
+        <w:t>- current dark ops theme</w:t>
+      </w:r>
+    </w:p>
+    <w:p>
+      <w:pPr>
+        <w:spacing w:after="0"/>
+        <w:rPr>
+          <w:sz w:val="22"/>
+          <w:szCs w:val="22"/>
+        </w:rPr>
+      </w:pPr>
+      <w:r>
+        <w:rPr>
+          <w:sz w:val="22"/>
+          <w:szCs w:val="22"/>
+        </w:rPr>
+        <w:t>- zoom/pan</w:t>
+      </w:r>
+    </w:p>
+    <w:p>
+      <w:pPr>
+        <w:spacing w:after="0"/>
+        <w:rPr>
+          <w:sz w:val="22"/>
+          <w:szCs w:val="22"/>
+        </w:rPr>
+      </w:pPr>
+      <w:r>
+        <w:rPr>
+          <w:sz w:val="22"/>
+          <w:szCs w:val="22"/>
+        </w:rPr>
+        <w:t>- animated dashed edges</w:t>
+      </w:r>
+    </w:p>
+    <w:p>
+      <w:pPr>
+        <w:spacing w:after="0"/>
+        <w:rPr>
+          <w:sz w:val="22"/>
+          <w:szCs w:val="22"/>
+        </w:rPr>
+      </w:pPr>
+    </w:p>
+    <w:p>
+      <w:pPr>
+        <w:spacing w:after="0"/>
+        <w:rPr>
+          <w:sz w:val="22"/>
+          <w:szCs w:val="22"/>
+        </w:rPr>
+      </w:pPr>
+      <w:r>
+        <w:rPr>
+          <w:sz w:val="22"/>
+          <w:szCs w:val="22"/>
+        </w:rPr>
+        <w:t>Current report set must include:</w:t>
+      </w:r>
+    </w:p>
+    <w:p>
+      <w:pPr>
+        <w:spacing w:after="0"/>
+        <w:rPr>
+          <w:sz w:val="22"/>
+          <w:szCs w:val="22"/>
+        </w:rPr>
+      </w:pPr>
+      <w:r>
+        <w:rPr>
+          <w:sz w:val="22"/>
+          <w:szCs w:val="22"/>
+        </w:rPr>
+        <w:t>- `FLOW MAP`</w:t>
+      </w:r>
+    </w:p>
+    <w:p>
+      <w:pPr>
+        <w:spacing w:after="0"/>
+        <w:rPr>
+          <w:sz w:val="22"/>
+          <w:szCs w:val="22"/>
+        </w:rPr>
+      </w:pPr>
+      <w:r>
+        <w:rPr>
+          <w:sz w:val="22"/>
+          <w:szCs w:val="22"/>
+        </w:rPr>
+        <w:t>- `DIAGNOSIS`</w:t>
+      </w:r>
+    </w:p>
+    <w:p>
+      <w:pPr>
+        <w:spacing w:after="0"/>
+        <w:rPr>
+          <w:sz w:val="22"/>
+          <w:szCs w:val="22"/>
+        </w:rPr>
+      </w:pPr>
+      <w:r>
+        <w:rPr>
+          <w:sz w:val="22"/>
+          <w:szCs w:val="22"/>
+        </w:rPr>
+        <w:t>- `KAIZEN`</w:t>
+      </w:r>
+    </w:p>
+    <w:p>
+      <w:pPr>
+        <w:spacing w:after="0"/>
+        <w:rPr>
+          <w:sz w:val="22"/>
+          <w:szCs w:val="22"/>
+        </w:rPr>
+      </w:pPr>
+      <w:r>
+        <w:rPr>
+          <w:sz w:val="22"/>
+          <w:szCs w:val="22"/>
+        </w:rPr>
+        <w:t>- `THROUGHPUT`</w:t>
+      </w:r>
+    </w:p>
+    <w:p>
+      <w:pPr>
+        <w:spacing w:after="0"/>
+        <w:rPr>
+          <w:sz w:val="22"/>
+          <w:szCs w:val="22"/>
+        </w:rPr>
+      </w:pPr>
+      <w:r>
+        <w:rPr>
+          <w:sz w:val="22"/>
+          <w:szCs w:val="22"/>
+        </w:rPr>
+        <w:t>- `WASTE`</w:t>
+      </w:r>
+    </w:p>
+    <w:p>
+      <w:pPr>
+        <w:spacing w:after="0"/>
+        <w:rPr>
+          <w:sz w:val="22"/>
+          <w:szCs w:val="22"/>
+        </w:rPr>
+      </w:pPr>
+    </w:p>
+    <w:p>
+      <w:pPr>
+        <w:spacing w:after="0"/>
+        <w:rPr>
+          <w:sz w:val="22"/>
+          <w:szCs w:val="22"/>
+        </w:rPr>
+      </w:pPr>
+      <w:r>
+        <w:rPr>
+          <w:sz w:val="22"/>
+          <w:szCs w:val="22"/>
+        </w:rPr>
+        <w:t>View button rules:</w:t>
+      </w:r>
+    </w:p>
+    <w:p>
+      <w:pPr>
+        <w:spacing w:after="0"/>
+        <w:rPr>
+          <w:sz w:val="22"/>
+          <w:szCs w:val="22"/>
+        </w:rPr>
+      </w:pPr>
+      <w:r>
+        <w:rPr>
+          <w:sz w:val="22"/>
+          <w:szCs w:val="22"/>
+        </w:rPr>
+        <w:t>- large buttons</w:t>
+      </w:r>
+    </w:p>
+    <w:p>
+      <w:pPr>
+        <w:spacing w:after="0"/>
+        <w:rPr>
+          <w:sz w:val="22"/>
+          <w:szCs w:val="22"/>
+        </w:rPr>
+      </w:pPr>
+      <w:r>
+        <w:rPr>
+          <w:sz w:val="22"/>
+          <w:szCs w:val="22"/>
+        </w:rPr>
+        <w:t xml:space="preserve">- fill the view card </w:t>
+      </w:r>
+      <w:proofErr w:type="gramStart"/>
+      <w:r>
+        <w:rPr>
+          <w:sz w:val="22"/>
+          <w:szCs w:val="22"/>
+        </w:rPr>
+        <w:t>width</w:t>
+      </w:r>
+      <w:proofErr w:type="gramEnd"/>
+      <w:r>
+        <w:rPr>
+          <w:sz w:val="22"/>
+          <w:szCs w:val="22"/>
+        </w:rPr>
+        <w:t xml:space="preserve"> evenly</w:t>
+      </w:r>
+    </w:p>
+    <w:p>
+      <w:pPr>
+        <w:spacing w:after="0"/>
+        <w:rPr>
+          <w:sz w:val="22"/>
+          <w:szCs w:val="22"/>
+        </w:rPr>
+      </w:pPr>
+      <w:r>
+        <w:rPr>
+          <w:sz w:val="22"/>
+          <w:szCs w:val="22"/>
+        </w:rPr>
+        <w:t>- `(i)` explainer inside each button</w:t>
+      </w:r>
+    </w:p>
+    <w:p>
+      <w:pPr>
+        <w:spacing w:after="0"/>
+        <w:rPr>
+          <w:sz w:val="22"/>
+          <w:szCs w:val="22"/>
+        </w:rPr>
+      </w:pPr>
+    </w:p>
+    <w:p>
+      <w:pPr>
+        <w:spacing w:after="0"/>
+        <w:rPr>
+          <w:sz w:val="22"/>
+          <w:szCs w:val="22"/>
+        </w:rPr>
+      </w:pPr>
+      <w:r>
+        <w:rPr>
+          <w:sz w:val="22"/>
+          <w:szCs w:val="22"/>
+        </w:rPr>
+        <w:t>Node cards must show:</w:t>
+      </w:r>
+    </w:p>
+    <w:p>
+      <w:pPr>
+        <w:spacing w:after="0"/>
+        <w:rPr>
+          <w:sz w:val="22"/>
+          <w:szCs w:val="22"/>
+        </w:rPr>
+      </w:pPr>
+      <w:r>
+        <w:rPr>
+          <w:sz w:val="22"/>
+          <w:szCs w:val="22"/>
+        </w:rPr>
+        <w:t>- util</w:t>
+      </w:r>
+    </w:p>
+    <w:p>
+      <w:pPr>
+        <w:spacing w:after="0"/>
+        <w:rPr>
+          <w:sz w:val="22"/>
+          <w:szCs w:val="22"/>
+        </w:rPr>
+      </w:pPr>
+      <w:r>
+        <w:rPr>
+          <w:sz w:val="22"/>
+          <w:szCs w:val="22"/>
+        </w:rPr>
+        <w:t>- lot/</w:t>
+      </w:r>
+      <w:proofErr w:type="spellStart"/>
+      <w:r>
+        <w:rPr>
+          <w:sz w:val="22"/>
+          <w:szCs w:val="22"/>
+        </w:rPr>
+        <w:t>wip</w:t>
+      </w:r>
+      <w:proofErr w:type="spellEnd"/>
+    </w:p>
+    <w:p>
+      <w:pPr>
+        <w:spacing w:after="0"/>
+        <w:rPr>
+          <w:sz w:val="22"/>
+          <w:szCs w:val="22"/>
+        </w:rPr>
+      </w:pPr>
+      <w:r>
+        <w:rPr>
+          <w:sz w:val="22"/>
+          <w:szCs w:val="22"/>
+        </w:rPr>
+        <w:t>- Completed Lot</w:t>
+      </w:r>
+    </w:p>
+    <w:p>
+      <w:pPr>
+        <w:spacing w:after="0"/>
+        <w:rPr>
+          <w:sz w:val="22"/>
+          <w:szCs w:val="22"/>
+        </w:rPr>
+      </w:pPr>
+      <w:r>
+        <w:rPr>
+          <w:sz w:val="22"/>
+          <w:szCs w:val="22"/>
+        </w:rPr>
+        <w:t>- status</w:t>
+      </w:r>
+    </w:p>
+    <w:p>
+      <w:pPr>
+        <w:spacing w:after="0"/>
+        <w:rPr>
+          <w:sz w:val="22"/>
+          <w:szCs w:val="22"/>
+        </w:rPr>
+      </w:pPr>
+    </w:p>
+    <w:p>
+      <w:pPr>
+        <w:spacing w:after="0"/>
+        <w:rPr>
+          <w:sz w:val="22"/>
+          <w:szCs w:val="22"/>
+        </w:rPr>
+      </w:pPr>
+      <w:r>
+        <w:rPr>
+          <w:sz w:val="22"/>
+          <w:szCs w:val="22"/>
+        </w:rPr>
+        <w:lastRenderedPageBreak/>
+        <w:t>PHASE 4 — Real-time forecast runtime</w:t>
+      </w:r>
+    </w:p>
+    <w:p>
+      <w:pPr>
+        <w:spacing w:after="0"/>
+        <w:rPr>
+          <w:sz w:val="22"/>
+          <w:szCs w:val="22"/>
+        </w:rPr>
+      </w:pPr>
+      <w:r>
+        <w:rPr>
+          <w:sz w:val="22"/>
+          <w:szCs w:val="22"/>
+        </w:rPr>
+        <w:t>Keep deterministic live behavior with elapsed time.</w:t>
+      </w:r>
+    </w:p>
+    <w:p>
+      <w:pPr>
+        <w:spacing w:after="0"/>
+        <w:rPr>
+          <w:sz w:val="22"/>
+          <w:szCs w:val="22"/>
+        </w:rPr>
+      </w:pPr>
+      <w:r>
+        <w:rPr>
+          <w:sz w:val="22"/>
+          <w:szCs w:val="22"/>
+        </w:rPr>
+        <w:t>Requirements:</w:t>
+      </w:r>
+    </w:p>
+    <w:p>
+      <w:pPr>
+        <w:spacing w:after="0"/>
+        <w:rPr>
+          <w:sz w:val="22"/>
+          <w:szCs w:val="22"/>
+        </w:rPr>
+      </w:pPr>
+      <w:r>
+        <w:rPr>
+          <w:sz w:val="22"/>
+          <w:szCs w:val="22"/>
+        </w:rPr>
+        <w:t>- WIP starts at 0 and evolves over time</w:t>
+      </w:r>
+    </w:p>
+    <w:p>
+      <w:pPr>
+        <w:spacing w:after="0"/>
+        <w:rPr>
+          <w:sz w:val="22"/>
+          <w:szCs w:val="22"/>
+        </w:rPr>
+      </w:pPr>
+      <w:r>
+        <w:rPr>
+          <w:sz w:val="22"/>
+          <w:szCs w:val="22"/>
+        </w:rPr>
+        <w:t>- speed controls: x1, x2, x5, x50, x200, 5s/</w:t>
+      </w:r>
+      <w:proofErr w:type="spellStart"/>
+      <w:r>
+        <w:rPr>
+          <w:sz w:val="22"/>
+          <w:szCs w:val="22"/>
+        </w:rPr>
+        <w:t>mo</w:t>
+      </w:r>
+      <w:proofErr w:type="spellEnd"/>
+    </w:p>
+    <w:p>
+      <w:pPr>
+        <w:spacing w:after="0"/>
+        <w:rPr>
+          <w:sz w:val="22"/>
+          <w:szCs w:val="22"/>
+        </w:rPr>
+      </w:pPr>
+      <w:r>
+        <w:rPr>
+          <w:sz w:val="22"/>
+          <w:szCs w:val="22"/>
+        </w:rPr>
+        <w:t>- Start / Pause / Reset Time controls</w:t>
+      </w:r>
+    </w:p>
+    <w:p>
+      <w:pPr>
+        <w:spacing w:after="0"/>
+        <w:rPr>
+          <w:sz w:val="22"/>
+          <w:szCs w:val="22"/>
+        </w:rPr>
+      </w:pPr>
+      <w:r>
+        <w:rPr>
+          <w:sz w:val="22"/>
+          <w:szCs w:val="22"/>
+        </w:rPr>
+        <w:t>- `Reset Time` resets time/view only, not edited parameters</w:t>
+      </w:r>
+    </w:p>
+    <w:p>
+      <w:pPr>
+        <w:spacing w:after="0"/>
+        <w:rPr>
+          <w:sz w:val="22"/>
+          <w:szCs w:val="22"/>
+        </w:rPr>
+      </w:pPr>
+      <w:r>
+        <w:rPr>
+          <w:sz w:val="22"/>
+          <w:szCs w:val="22"/>
+        </w:rPr>
+        <w:t xml:space="preserve">- </w:t>
+      </w:r>
+      <w:proofErr w:type="gramStart"/>
+      <w:r>
+        <w:rPr>
+          <w:sz w:val="22"/>
+          <w:szCs w:val="22"/>
+        </w:rPr>
+        <w:t>instant</w:t>
+      </w:r>
+      <w:proofErr w:type="gramEnd"/>
+      <w:r>
+        <w:rPr>
+          <w:sz w:val="22"/>
+          <w:szCs w:val="22"/>
+        </w:rPr>
+        <w:t xml:space="preserve"> recompute on committed parameter changes</w:t>
+      </w:r>
+    </w:p>
+    <w:p>
+      <w:pPr>
+        <w:spacing w:after="0"/>
+        <w:rPr>
+          <w:sz w:val="22"/>
+          <w:szCs w:val="22"/>
+        </w:rPr>
+      </w:pPr>
+    </w:p>
+    <w:p>
+      <w:pPr>
+        <w:spacing w:after="0"/>
+        <w:rPr>
+          <w:sz w:val="22"/>
+          <w:szCs w:val="22"/>
+        </w:rPr>
+      </w:pPr>
+      <w:r>
+        <w:rPr>
+          <w:sz w:val="22"/>
+          <w:szCs w:val="22"/>
+        </w:rPr>
+        <w:t>PHASE 5 — Operational Diagnosis</w:t>
+      </w:r>
+    </w:p>
+    <w:p>
+      <w:pPr>
+        <w:spacing w:after="0"/>
+        <w:rPr>
+          <w:sz w:val="22"/>
+          <w:szCs w:val="22"/>
+        </w:rPr>
+      </w:pPr>
+      <w:r>
+        <w:rPr>
+          <w:sz w:val="22"/>
+          <w:szCs w:val="22"/>
+        </w:rPr>
+        <w:t>Use skill: `</w:t>
+      </w:r>
+      <w:proofErr w:type="gramStart"/>
+      <w:r>
+        <w:rPr>
+          <w:sz w:val="22"/>
+          <w:szCs w:val="22"/>
+        </w:rPr>
+        <w:t>operational-diagnosis</w:t>
+      </w:r>
+      <w:proofErr w:type="gramEnd"/>
+      <w:r>
+        <w:rPr>
+          <w:sz w:val="22"/>
+          <w:szCs w:val="22"/>
+        </w:rPr>
+        <w:t>`</w:t>
+      </w:r>
+    </w:p>
+    <w:p>
+      <w:pPr>
+        <w:spacing w:after="0"/>
+        <w:rPr>
+          <w:sz w:val="22"/>
+          <w:szCs w:val="22"/>
+        </w:rPr>
+      </w:pPr>
+      <w:r>
+        <w:rPr>
+          <w:sz w:val="22"/>
+          <w:szCs w:val="22"/>
+        </w:rPr>
+        <w:t>Run immediately after forecast results are available and before export.</w:t>
+      </w:r>
+    </w:p>
+    <w:p>
+      <w:pPr>
+        <w:spacing w:after="0"/>
+        <w:rPr>
+          <w:sz w:val="22"/>
+          <w:szCs w:val="22"/>
+        </w:rPr>
+      </w:pPr>
+    </w:p>
+    <w:p>
+      <w:pPr>
+        <w:spacing w:after="0"/>
+        <w:rPr>
+          <w:sz w:val="22"/>
+          <w:szCs w:val="22"/>
+        </w:rPr>
+      </w:pPr>
+      <w:r>
+        <w:rPr>
+          <w:sz w:val="22"/>
+          <w:szCs w:val="22"/>
+        </w:rPr>
+        <w:t>Create:</w:t>
+      </w:r>
+    </w:p>
+    <w:p>
+      <w:pPr>
+        <w:spacing w:after="0"/>
+        <w:rPr>
+          <w:sz w:val="22"/>
+          <w:szCs w:val="22"/>
+        </w:rPr>
+      </w:pPr>
+      <w:r>
+        <w:rPr>
+          <w:sz w:val="22"/>
+          <w:szCs w:val="22"/>
+        </w:rPr>
+        <w:t>- `models/active/</w:t>
+      </w:r>
+      <w:proofErr w:type="spellStart"/>
+      <w:r>
+        <w:rPr>
+          <w:sz w:val="22"/>
+          <w:szCs w:val="22"/>
+        </w:rPr>
+        <w:t>operational_diagnosis.json</w:t>
+      </w:r>
+      <w:proofErr w:type="spellEnd"/>
+      <w:r>
+        <w:rPr>
+          <w:sz w:val="22"/>
+          <w:szCs w:val="22"/>
+        </w:rPr>
+        <w:t>`</w:t>
+      </w:r>
+    </w:p>
+    <w:p>
+      <w:pPr>
+        <w:spacing w:after="0"/>
+        <w:rPr>
+          <w:sz w:val="22"/>
+          <w:szCs w:val="22"/>
+        </w:rPr>
+      </w:pPr>
+      <w:r>
+        <w:rPr>
+          <w:sz w:val="22"/>
+          <w:szCs w:val="22"/>
+        </w:rPr>
+        <w:t>- `models/active/operational_diagnosis.md`</w:t>
+      </w:r>
+    </w:p>
+    <w:p>
+      <w:pPr>
+        <w:spacing w:after="0"/>
+        <w:rPr>
+          <w:sz w:val="22"/>
+          <w:szCs w:val="22"/>
+        </w:rPr>
+      </w:pPr>
+    </w:p>
+    <w:p>
+      <w:pPr>
+        <w:spacing w:after="0"/>
+        <w:rPr>
+          <w:sz w:val="22"/>
+          <w:szCs w:val="22"/>
+        </w:rPr>
+      </w:pPr>
+      <w:r>
+        <w:rPr>
+          <w:sz w:val="22"/>
+          <w:szCs w:val="22"/>
+        </w:rPr>
+        <w:t>Requirements:</w:t>
+      </w:r>
+    </w:p>
+    <w:p>
+      <w:pPr>
+        <w:spacing w:after="0"/>
+        <w:rPr>
+          <w:sz w:val="22"/>
+          <w:szCs w:val="22"/>
+        </w:rPr>
+      </w:pPr>
+      <w:r>
+        <w:rPr>
+          <w:sz w:val="22"/>
+          <w:szCs w:val="22"/>
+        </w:rPr>
+        <w:t>- do not just restate metrics</w:t>
+      </w:r>
+    </w:p>
+    <w:p>
+      <w:pPr>
+        <w:spacing w:after="0"/>
+        <w:rPr>
+          <w:sz w:val="22"/>
+          <w:szCs w:val="22"/>
+        </w:rPr>
+      </w:pPr>
+      <w:r>
+        <w:rPr>
+          <w:sz w:val="22"/>
+          <w:szCs w:val="22"/>
+        </w:rPr>
+        <w:t>- explain what is breaking</w:t>
+      </w:r>
+    </w:p>
+    <w:p>
+      <w:pPr>
+        <w:spacing w:after="0"/>
+        <w:rPr>
+          <w:sz w:val="22"/>
+          <w:szCs w:val="22"/>
+        </w:rPr>
+      </w:pPr>
+      <w:r>
+        <w:rPr>
+          <w:sz w:val="22"/>
+          <w:szCs w:val="22"/>
+        </w:rPr>
+        <w:t>- explain why</w:t>
+      </w:r>
+    </w:p>
+    <w:p>
+      <w:pPr>
+        <w:spacing w:after="0"/>
+        <w:rPr>
+          <w:sz w:val="22"/>
+          <w:szCs w:val="22"/>
+        </w:rPr>
+      </w:pPr>
+      <w:r>
+        <w:rPr>
+          <w:sz w:val="22"/>
+          <w:szCs w:val="22"/>
+        </w:rPr>
+        <w:t>- explain downstream effects</w:t>
+      </w:r>
+    </w:p>
+    <w:p>
+      <w:pPr>
+        <w:spacing w:after="0"/>
+        <w:rPr>
+          <w:sz w:val="22"/>
+          <w:szCs w:val="22"/>
+        </w:rPr>
+      </w:pPr>
+      <w:r>
+        <w:rPr>
+          <w:sz w:val="22"/>
+          <w:szCs w:val="22"/>
+        </w:rPr>
+        <w:t>- recommend stabilizing action</w:t>
+      </w:r>
+    </w:p>
+    <w:p>
+      <w:pPr>
+        <w:spacing w:after="0"/>
+        <w:rPr>
+          <w:sz w:val="22"/>
+          <w:szCs w:val="22"/>
+        </w:rPr>
+      </w:pPr>
+      <w:r>
+        <w:rPr>
+          <w:sz w:val="22"/>
+          <w:szCs w:val="22"/>
+        </w:rPr>
+        <w:t>- explain business impact</w:t>
+      </w:r>
+    </w:p>
+    <w:p>
+      <w:pPr>
+        <w:spacing w:after="0"/>
+        <w:rPr>
+          <w:sz w:val="22"/>
+          <w:szCs w:val="22"/>
+        </w:rPr>
+      </w:pPr>
+      <w:r>
+        <w:rPr>
+          <w:sz w:val="22"/>
+          <w:szCs w:val="22"/>
+        </w:rPr>
+        <w:t>- include AI Opportunity Lens</w:t>
+      </w:r>
+    </w:p>
+    <w:p>
+      <w:pPr>
+        <w:spacing w:after="0"/>
+        <w:rPr>
+          <w:sz w:val="22"/>
+          <w:szCs w:val="22"/>
+        </w:rPr>
+      </w:pPr>
+      <w:r>
+        <w:rPr>
+          <w:sz w:val="22"/>
+          <w:szCs w:val="22"/>
+        </w:rPr>
+        <w:t>- include confidence and missing fields if data is incomplete</w:t>
+      </w:r>
+    </w:p>
+    <w:p>
+      <w:pPr>
+        <w:spacing w:after="0"/>
+        <w:rPr>
+          <w:sz w:val="22"/>
+          <w:szCs w:val="22"/>
+        </w:rPr>
+      </w:pPr>
+    </w:p>
+    <w:p>
+      <w:pPr>
+        <w:spacing w:after="0"/>
+        <w:rPr>
+          <w:sz w:val="22"/>
+          <w:szCs w:val="22"/>
+        </w:rPr>
+      </w:pPr>
+      <w:r>
+        <w:rPr>
+          <w:sz w:val="22"/>
+          <w:szCs w:val="22"/>
+        </w:rPr>
+        <w:t>PHASE 6 — Export</w:t>
+      </w:r>
+    </w:p>
+    <w:p>
+      <w:pPr>
+        <w:spacing w:after="0"/>
+        <w:rPr>
+          <w:sz w:val="22"/>
+          <w:szCs w:val="22"/>
+        </w:rPr>
+      </w:pPr>
+      <w:r>
+        <w:rPr>
+          <w:sz w:val="22"/>
+          <w:szCs w:val="22"/>
+        </w:rPr>
+        <w:t>Use skill: `export-scenario-bundle`</w:t>
+      </w:r>
+    </w:p>
+    <w:p>
+      <w:pPr>
+        <w:spacing w:after="0"/>
+        <w:rPr>
+          <w:sz w:val="22"/>
+          <w:szCs w:val="22"/>
+        </w:rPr>
+      </w:pPr>
+    </w:p>
+    <w:p>
+      <w:pPr>
+        <w:spacing w:after="0"/>
+        <w:rPr>
+          <w:sz w:val="22"/>
+          <w:szCs w:val="22"/>
+        </w:rPr>
+      </w:pPr>
+      <w:r>
+        <w:rPr>
+          <w:sz w:val="22"/>
+          <w:szCs w:val="22"/>
+        </w:rPr>
+        <w:t>Export the accepted scenario bundle including:</w:t>
+      </w:r>
+    </w:p>
+    <w:p>
+      <w:pPr>
+        <w:spacing w:after="0"/>
+        <w:rPr>
+          <w:sz w:val="22"/>
+          <w:szCs w:val="22"/>
+        </w:rPr>
+      </w:pPr>
+      <w:r>
+        <w:rPr>
+          <w:sz w:val="22"/>
+          <w:szCs w:val="22"/>
+        </w:rPr>
+        <w:t>- committed scenario</w:t>
+      </w:r>
+    </w:p>
+    <w:p>
+      <w:pPr>
+        <w:spacing w:after="0"/>
+        <w:rPr>
+          <w:sz w:val="22"/>
+          <w:szCs w:val="22"/>
+        </w:rPr>
+      </w:pPr>
+      <w:r>
+        <w:rPr>
+          <w:sz w:val="22"/>
+          <w:szCs w:val="22"/>
+        </w:rPr>
+        <w:t>- result metrics</w:t>
+      </w:r>
+    </w:p>
+    <w:p>
+      <w:pPr>
+        <w:spacing w:after="0"/>
+        <w:rPr>
+          <w:sz w:val="22"/>
+          <w:szCs w:val="22"/>
+        </w:rPr>
+      </w:pPr>
+      <w:r>
+        <w:rPr>
+          <w:sz w:val="22"/>
+          <w:szCs w:val="22"/>
+        </w:rPr>
+        <w:t>- operational diagnosis</w:t>
+      </w:r>
+    </w:p>
+    <w:p>
+      <w:pPr>
+        <w:spacing w:after="0"/>
+        <w:rPr>
+          <w:sz w:val="22"/>
+          <w:szCs w:val="22"/>
+        </w:rPr>
+      </w:pPr>
+      <w:r>
+        <w:rPr>
+          <w:sz w:val="22"/>
+          <w:szCs w:val="22"/>
+        </w:rPr>
+        <w:t>- browser snapshot</w:t>
+      </w:r>
+    </w:p>
+    <w:p>
+      <w:pPr>
+        <w:spacing w:after="0"/>
+        <w:rPr>
+          <w:sz w:val="22"/>
+          <w:szCs w:val="22"/>
+        </w:rPr>
+      </w:pPr>
+      <w:r>
+        <w:rPr>
+          <w:sz w:val="22"/>
+          <w:szCs w:val="22"/>
+        </w:rPr>
+        <w:t>- full app package if supported</w:t>
+      </w:r>
+    </w:p>
+    <w:p>
+      <w:pPr>
+        <w:spacing w:after="0"/>
+        <w:rPr>
+          <w:sz w:val="22"/>
+          <w:szCs w:val="22"/>
+        </w:rPr>
+      </w:pPr>
+    </w:p>
+    <w:p>
+      <w:pPr>
+        <w:spacing w:after="0"/>
+        <w:rPr>
+          <w:sz w:val="22"/>
+          <w:szCs w:val="22"/>
+        </w:rPr>
+      </w:pPr>
+      <w:r>
+        <w:rPr>
+          <w:sz w:val="22"/>
+          <w:szCs w:val="22"/>
+        </w:rPr>
+        <w:t>Verification:</w:t>
+      </w:r>
+    </w:p>
+    <w:p>
+      <w:pPr>
+        <w:spacing w:after="0"/>
+        <w:rPr>
+          <w:sz w:val="22"/>
+          <w:szCs w:val="22"/>
+        </w:rPr>
+      </w:pPr>
+      <w:r>
+        <w:rPr>
+          <w:sz w:val="22"/>
+          <w:szCs w:val="22"/>
+        </w:rPr>
+        <w:t>Run the relevant build / validate / export commands and report:</w:t>
+      </w:r>
+    </w:p>
+    <w:p>
+      <w:pPr>
+        <w:spacing w:after="0"/>
+        <w:rPr>
+          <w:sz w:val="22"/>
+          <w:szCs w:val="22"/>
+        </w:rPr>
+      </w:pPr>
+      <w:r>
+        <w:rPr>
+          <w:sz w:val="22"/>
+          <w:szCs w:val="22"/>
+        </w:rPr>
+        <w:t>- what passed</w:t>
+      </w:r>
+    </w:p>
+    <w:p>
+      <w:pPr>
+        <w:spacing w:after="0"/>
+        <w:rPr>
+          <w:sz w:val="22"/>
+          <w:szCs w:val="22"/>
+        </w:rPr>
+      </w:pPr>
+      <w:r>
+        <w:rPr>
+          <w:sz w:val="22"/>
+          <w:szCs w:val="22"/>
+        </w:rPr>
+        <w:t>- what failed</w:t>
+      </w:r>
+    </w:p>
+    <w:p>
+      <w:pPr>
+        <w:spacing w:after="0"/>
+        <w:rPr>
+          <w:sz w:val="22"/>
+          <w:szCs w:val="22"/>
+        </w:rPr>
+      </w:pPr>
+      <w:r>
+        <w:rPr>
+          <w:sz w:val="22"/>
+          <w:szCs w:val="22"/>
+        </w:rPr>
+        <w:lastRenderedPageBreak/>
+        <w:t>- what was not run</w:t>
+      </w:r>
+    </w:p>
+    <w:p>
+      <w:pPr>
+        <w:spacing w:after="0"/>
+        <w:rPr>
+          <w:sz w:val="22"/>
+          <w:szCs w:val="22"/>
+        </w:rPr>
+      </w:pPr>
+    </w:p>
+    <w:p>
+      <w:pPr>
+        <w:spacing w:after="0"/>
+        <w:rPr>
+          <w:sz w:val="22"/>
+          <w:szCs w:val="22"/>
+        </w:rPr>
+      </w:pPr>
+      <w:r>
+        <w:rPr>
+          <w:sz w:val="22"/>
+          <w:szCs w:val="22"/>
+        </w:rPr>
+        <w:t xml:space="preserve">Final </w:t>
+      </w:r>
+      <w:proofErr w:type="gramStart"/>
+      <w:r>
+        <w:rPr>
+          <w:sz w:val="22"/>
+          <w:szCs w:val="22"/>
+        </w:rPr>
+        <w:t>deliverables</w:t>
+      </w:r>
+      <w:proofErr w:type="gramEnd"/>
+      <w:r>
+        <w:rPr>
+          <w:sz w:val="22"/>
+          <w:szCs w:val="22"/>
+        </w:rPr>
+        <w:t>:</w:t>
+      </w:r>
+    </w:p>
+    <w:p>
+      <w:pPr>
+        <w:spacing w:after="0"/>
+        <w:rPr>
+          <w:sz w:val="22"/>
+          <w:szCs w:val="22"/>
+        </w:rPr>
+      </w:pPr>
+      <w:r>
+        <w:rPr>
+          <w:sz w:val="22"/>
+          <w:szCs w:val="22"/>
+        </w:rPr>
+        <w:t>- working app</w:t>
+      </w:r>
+    </w:p>
+    <w:p>
+      <w:pPr>
+        <w:spacing w:after="0"/>
+        <w:rPr>
+          <w:sz w:val="22"/>
+          <w:szCs w:val="22"/>
+        </w:rPr>
+      </w:pPr>
+      <w:r>
+        <w:rPr>
+          <w:sz w:val="22"/>
+          <w:szCs w:val="22"/>
+        </w:rPr>
+        <w:t>- operational diagnosis</w:t>
+      </w:r>
+    </w:p>
+    <w:p>
+      <w:pPr>
+        <w:spacing w:after="0"/>
+        <w:rPr>
+          <w:sz w:val="22"/>
+          <w:szCs w:val="22"/>
+        </w:rPr>
+      </w:pPr>
+      <w:r>
+        <w:rPr>
+          <w:sz w:val="22"/>
+          <w:szCs w:val="22"/>
+        </w:rPr>
+        <w:t>- export bundle path</w:t>
+      </w:r>
+    </w:p>
+    <w:p>
+      <w:pPr>
+        <w:spacing w:after="0"/>
+        <w:rPr>
+          <w:sz w:val="22"/>
+          <w:szCs w:val="22"/>
+        </w:rPr>
+      </w:pPr>
+      <w:r>
+        <w:rPr>
+          <w:sz w:val="22"/>
+          <w:szCs w:val="22"/>
+        </w:rPr>
+        <w:t>- short summary of system status</w:t>
+      </w:r>
+    </w:p>
+    <w:p>
+      <w:pPr>
+        <w:spacing w:after="0"/>
+        <w:rPr>
+          <w:sz w:val="22"/>
+          <w:szCs w:val="22"/>
+        </w:rPr>
+      </w:pPr>
+      <w:r>
+        <w:rPr>
+          <w:sz w:val="22"/>
+          <w:szCs w:val="22"/>
+        </w:rPr>
+        <w:t>- active bottleneck</w:t>
+      </w:r>
+    </w:p>
+    <w:p>
+      <w:pPr>
+        <w:spacing w:after="0"/>
+        <w:rPr>
+          <w:sz w:val="22"/>
+          <w:szCs w:val="22"/>
+        </w:rPr>
+      </w:pPr>
+      <w:r>
+        <w:rPr>
+          <w:sz w:val="22"/>
+          <w:szCs w:val="22"/>
+        </w:rPr>
+        <w:t>- recommended intervention</w:t>
+      </w:r>
+    </w:p>
+    <w:p>
+      <w:pPr>
+        <w:spacing w:after="0"/>
+        <w:rPr>
+          <w:sz w:val="22"/>
+          <w:szCs w:val="22"/>
+        </w:rPr>
+      </w:pPr>
+    </w:p>
+    <w:p>
+      <w:pPr>
+        <w:spacing w:after="0"/>
+        <w:rPr>
+          <w:sz w:val="22"/>
+          <w:szCs w:val="22"/>
+        </w:rPr>
+      </w:pPr>
+    </w:p>
+    <w:p>
+      <w:pPr>
+        <w:spacing w:after="0"/>
+        <w:rPr>
+          <w:b/>
+          <w:bCs/>
+        </w:rPr>
+      </w:pPr>
+      <w:r>
+        <w:rPr>
+          <w:b/>
+          <w:bCs/>
+        </w:rPr>
         <w:t>PRMPT #2: REPLIT EXPORT</w:t>
       </w:r>
     </w:p>
@@ -1371,6 +4547,7 @@
         <w:spacing w:after="0"/>
       </w:pPr>
       <w:r>
+        <w:lastRenderedPageBreak/>
         <w:t>- `deploy/</w:t>
       </w:r>
       <w:proofErr w:type="spellStart"/>
@@ -1395,7 +4572,6 @@
         <w:spacing w:after="0"/>
       </w:pPr>
       <w:r>
-        <w:lastRenderedPageBreak/>
         <w:t>- `deploy/</w:t>
       </w:r>
       <w:proofErr w:type="spellStart"/>

</xml_diff>